<commit_message>
Change files and add PDF versions
</commit_message>
<xml_diff>
--- a/User and Installation Manuals/User Manual - IT01 - Farm Dog - v2.2.docx
+++ b/User and Installation Manuals/User Manual - IT01 - Farm Dog - v2.2.docx
@@ -152,7 +152,7 @@
                   </wp:anchor>
                 </w:drawing>
               </mc:Choice>
-              <mc:Fallback xmlns:a="http://schemas.openxmlformats.org/drawingml/2006/main" xmlns:pic="http://schemas.openxmlformats.org/drawingml/2006/picture" xmlns:a14="http://schemas.microsoft.com/office/drawing/2010/main" xmlns:a16="http://schemas.microsoft.com/office/drawing/2014/main" xmlns:arto="http://schemas.microsoft.com/office/word/2006/arto">
+              <mc:Fallback xmlns:arto="http://schemas.microsoft.com/office/word/2006/arto" xmlns:a16="http://schemas.microsoft.com/office/drawing/2014/main" xmlns:a14="http://schemas.microsoft.com/office/drawing/2010/main" xmlns:pic="http://schemas.openxmlformats.org/drawingml/2006/picture" xmlns:a="http://schemas.openxmlformats.org/drawingml/2006/main">
                 <w:pict w14:anchorId="44CB2A3F">
                   <v:shapetype id="_x0000_t202" coordsize="21600,21600" o:spt="202" path="m,l,21600r21600,l21600,xe" w14:anchorId="66515886">
                     <v:stroke joinstyle="miter"/>
@@ -484,7 +484,7 @@
                   </wp:anchor>
                 </w:drawing>
               </mc:Choice>
-              <mc:Fallback xmlns:a="http://schemas.openxmlformats.org/drawingml/2006/main" xmlns:pic="http://schemas.openxmlformats.org/drawingml/2006/picture" xmlns:a14="http://schemas.microsoft.com/office/drawing/2010/main" xmlns:a16="http://schemas.microsoft.com/office/drawing/2014/main" xmlns:arto="http://schemas.microsoft.com/office/word/2006/arto">
+              <mc:Fallback xmlns:arto="http://schemas.microsoft.com/office/word/2006/arto" xmlns:a16="http://schemas.microsoft.com/office/drawing/2014/main" xmlns:a14="http://schemas.microsoft.com/office/drawing/2010/main" xmlns:pic="http://schemas.openxmlformats.org/drawingml/2006/picture" xmlns:a="http://schemas.openxmlformats.org/drawingml/2006/main">
                 <w:pict w14:anchorId="7E175A18">
                   <v:group id="Group 157" style="position:absolute;margin-left:17.7pt;margin-top:19.2pt;width:8in;height:95.7pt;z-index:251662336;mso-width-percent:941;mso-height-percent:121;mso-position-horizontal-relative:page;mso-position-vertical-relative:page;mso-width-percent:941;mso-height-percent:121" coordsize="73152,12161" coordorigin="" o:spid="_x0000_s1026" w14:anchorId="1907A462" o:gfxdata="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">
                     <v:shape id="Rectangle 51" style="position:absolute;width:73152;height:11303;visibility:visible;mso-wrap-style:square;v-text-anchor:middle" coordsize="7312660,1129665" o:spid="_x0000_s1027" fillcolor="#156082 [3204]" stroked="f" strokeweight="1pt" path="m,l7312660,r,1129665l3619500,733425,,1091565,,xe" o:gfxdata="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">
@@ -622,7 +622,7 @@
                   </wp:anchor>
                 </w:drawing>
               </mc:Choice>
-              <mc:Fallback xmlns:a="http://schemas.openxmlformats.org/drawingml/2006/main" xmlns:pic="http://schemas.openxmlformats.org/drawingml/2006/picture" xmlns:a14="http://schemas.microsoft.com/office/drawing/2010/main" xmlns:a16="http://schemas.microsoft.com/office/drawing/2014/main" xmlns:arto="http://schemas.microsoft.com/office/word/2006/arto">
+              <mc:Fallback xmlns:arto="http://schemas.microsoft.com/office/word/2006/arto" xmlns:a16="http://schemas.microsoft.com/office/drawing/2014/main" xmlns:a14="http://schemas.microsoft.com/office/drawing/2010/main" xmlns:pic="http://schemas.openxmlformats.org/drawingml/2006/picture" xmlns:a="http://schemas.openxmlformats.org/drawingml/2006/main">
                 <w:pict w14:anchorId="70E092F7">
                   <v:shape id="Text Box 159" style="position:absolute;margin-left:0;margin-top:0;width:8in;height:1in;z-index:251658241;visibility:visible;mso-wrap-style:square;mso-width-percent:941;mso-height-percent:92;mso-top-percent:818;mso-wrap-distance-left:9pt;mso-wrap-distance-top:0;mso-wrap-distance-right:9pt;mso-wrap-distance-bottom:0;mso-position-horizontal:center;mso-position-horizontal-relative:page;mso-position-vertical-relative:page;mso-width-percent:941;mso-height-percent:92;mso-top-percent:818;mso-width-relative:page;mso-height-relative:page;v-text-anchor:bottom" o:spid="_x0000_s1027" filled="f" stroked="f" strokeweight=".5pt" type="#_x0000_t202" o:gfxdata="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" w14:anchorId="127508D9">
                     <v:textbox inset="126pt,0,54pt,0">
@@ -815,7 +815,7 @@
                   </wp:anchor>
                 </w:drawing>
               </mc:Choice>
-              <mc:Fallback xmlns:a="http://schemas.openxmlformats.org/drawingml/2006/main" xmlns:pic="http://schemas.openxmlformats.org/drawingml/2006/picture" xmlns:a14="http://schemas.microsoft.com/office/drawing/2010/main" xmlns:a16="http://schemas.microsoft.com/office/drawing/2014/main" xmlns:arto="http://schemas.microsoft.com/office/word/2006/arto">
+              <mc:Fallback xmlns:arto="http://schemas.microsoft.com/office/word/2006/arto" xmlns:a16="http://schemas.microsoft.com/office/drawing/2014/main" xmlns:a14="http://schemas.microsoft.com/office/drawing/2010/main" xmlns:pic="http://schemas.openxmlformats.org/drawingml/2006/picture" xmlns:a="http://schemas.openxmlformats.org/drawingml/2006/main">
                 <w:pict w14:anchorId="55A64385">
                   <v:shape id="Text Box 163" style="position:absolute;margin-left:0;margin-top:0;width:8in;height:286.5pt;z-index:251658240;visibility:visible;mso-wrap-style:square;mso-width-percent:941;mso-height-percent:363;mso-top-percent:300;mso-wrap-distance-left:9pt;mso-wrap-distance-top:0;mso-wrap-distance-right:9pt;mso-wrap-distance-bottom:0;mso-position-horizontal:center;mso-position-horizontal-relative:page;mso-position-vertical-relative:page;mso-width-percent:941;mso-height-percent:363;mso-top-percent:300;mso-width-relative:page;mso-height-relative:page;v-text-anchor:bottom" o:spid="_x0000_s1028" filled="f" stroked="f" strokeweight=".5pt" type="#_x0000_t202" o:gfxdata="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" w14:anchorId="0F42159F">
                     <v:textbox inset="126pt,0,54pt,0">
@@ -965,8 +965,13 @@
                                   <w:jc w:val="right"/>
                                 </w:pPr>
                                 <w:r>
-                                  <w:t>Client: Terry Koziniec</w:t>
+                                  <w:t xml:space="preserve">Client: Terry </w:t>
                                 </w:r>
+                                <w:proofErr w:type="spellStart"/>
+                                <w:r>
+                                  <w:t>Koziniec</w:t>
+                                </w:r>
+                                <w:proofErr w:type="spellEnd"/>
                               </w:p>
                               <w:p>
                                 <w:pPr>
@@ -995,7 +1000,7 @@
                   </wp:anchor>
                 </w:drawing>
               </mc:Choice>
-              <mc:Fallback xmlns:a="http://schemas.openxmlformats.org/drawingml/2006/main" xmlns:pic="http://schemas.openxmlformats.org/drawingml/2006/picture" xmlns:a14="http://schemas.microsoft.com/office/drawing/2010/main" xmlns:a16="http://schemas.microsoft.com/office/drawing/2014/main" xmlns:arto="http://schemas.microsoft.com/office/word/2006/arto">
+              <mc:Fallback xmlns:arto="http://schemas.microsoft.com/office/word/2006/arto" xmlns:a16="http://schemas.microsoft.com/office/drawing/2014/main" xmlns:a14="http://schemas.microsoft.com/office/drawing/2010/main" xmlns:pic="http://schemas.openxmlformats.org/drawingml/2006/picture" xmlns:a="http://schemas.openxmlformats.org/drawingml/2006/main">
                 <w:pict w14:anchorId="01FC5062">
                   <v:shape id="_x0000_s1029" style="position:absolute;margin-left:150.8pt;margin-top:64.7pt;width:308.25pt;height:110.6pt;z-index:251658245;visibility:visible;mso-wrap-style:square;mso-width-percent:0;mso-height-percent:200;mso-wrap-distance-left:9pt;mso-wrap-distance-top:3.6pt;mso-wrap-distance-right:9pt;mso-wrap-distance-bottom:3.6pt;mso-position-horizontal:absolute;mso-position-horizontal-relative:margin;mso-position-vertical:absolute;mso-position-vertical-relative:text;mso-width-percent:0;mso-height-percent:200;mso-width-relative:margin;mso-height-relative:margin;v-text-anchor:top" stroked="f" type="#_x0000_t202" o:gfxdata="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" w14:anchorId="5527028B">
                     <v:textbox style="mso-fit-shape-to-text:t">
@@ -1190,7 +1195,7 @@
                   </wp:anchor>
                 </w:drawing>
               </mc:Choice>
-              <mc:Fallback xmlns:a="http://schemas.openxmlformats.org/drawingml/2006/main" xmlns:pic="http://schemas.openxmlformats.org/drawingml/2006/picture" xmlns:a14="http://schemas.microsoft.com/office/drawing/2010/main" xmlns:a16="http://schemas.microsoft.com/office/drawing/2014/main" xmlns:arto="http://schemas.microsoft.com/office/word/2006/arto">
+              <mc:Fallback xmlns:arto="http://schemas.microsoft.com/office/word/2006/arto" xmlns:a16="http://schemas.microsoft.com/office/drawing/2014/main" xmlns:a14="http://schemas.microsoft.com/office/drawing/2010/main" xmlns:pic="http://schemas.openxmlformats.org/drawingml/2006/picture" xmlns:a="http://schemas.openxmlformats.org/drawingml/2006/main">
                 <w:pict w14:anchorId="59BF4E34">
                   <v:shape id="Text Box 161" style="position:absolute;margin-left:17.55pt;margin-top:603.4pt;width:8in;height:79.5pt;z-index:251658242;visibility:visible;mso-wrap-style:square;mso-width-percent:941;mso-height-percent:100;mso-wrap-distance-left:9pt;mso-wrap-distance-top:0;mso-wrap-distance-right:9pt;mso-wrap-distance-bottom:0;mso-position-horizontal:absolute;mso-position-horizontal-relative:page;mso-position-vertical:absolute;mso-position-vertical-relative:page;mso-width-percent:941;mso-height-percent:100;mso-width-relative:page;mso-height-relative:page;v-text-anchor:top" o:spid="_x0000_s1030" filled="f" stroked="f" strokeweight=".5pt" type="#_x0000_t202" o:gfxdata="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" w14:anchorId="1E21A773">
                     <v:textbox style="mso-fit-shape-to-text:t" inset="126pt,0,54pt,0">
@@ -1330,7 +1335,7 @@
                   <w:noProof/>
                   <w:sz w:val="24"/>
                   <w:szCs w:val="24"/>
-                  <w:lang w:eastAsia="en-GB"/>
+                  <w:lang w:eastAsia="en-AU"/>
                 </w:rPr>
               </w:pPr>
               <w:r>
@@ -1342,7 +1347,7 @@
               <w:r>
                 <w:fldChar w:fldCharType="separate"/>
               </w:r>
-              <w:hyperlink w:anchor="_Toc232003157" w:history="1">
+              <w:hyperlink w:anchor="_Toc232163453" w:history="1">
                 <w:r>
                   <w:rPr>
                     <w:rStyle w:val="Hyperlink"/>
@@ -1356,7 +1361,7 @@
                     <w:noProof/>
                     <w:sz w:val="24"/>
                     <w:szCs w:val="24"/>
-                    <w:lang w:eastAsia="en-GB"/>
+                    <w:lang w:eastAsia="en-AU"/>
                   </w:rPr>
                   <w:tab/>
                 </w:r>
@@ -1386,7 +1391,7 @@
                     <w:noProof/>
                     <w:webHidden/>
                   </w:rPr>
-                  <w:instrText xml:space="preserve"> PAGEREF _Toc232003157 \h </w:instrText>
+                  <w:instrText xml:space="preserve"> PAGEREF _Toc232163453 \h </w:instrText>
                 </w:r>
                 <w:r>
                   <w:rPr>
@@ -1429,10 +1434,10 @@
                   <w:noProof/>
                   <w:sz w:val="24"/>
                   <w:szCs w:val="24"/>
-                  <w:lang w:eastAsia="en-GB"/>
+                  <w:lang w:eastAsia="en-AU"/>
                 </w:rPr>
               </w:pPr>
-              <w:hyperlink w:anchor="_Toc232003158" w:history="1">
+              <w:hyperlink w:anchor="_Toc232163454" w:history="1">
                 <w:r>
                   <w:rPr>
                     <w:rStyle w:val="Hyperlink"/>
@@ -1446,7 +1451,7 @@
                     <w:noProof/>
                     <w:sz w:val="24"/>
                     <w:szCs w:val="24"/>
-                    <w:lang w:eastAsia="en-GB"/>
+                    <w:lang w:eastAsia="en-AU"/>
                   </w:rPr>
                   <w:tab/>
                 </w:r>
@@ -1477,7 +1482,7 @@
                     <w:noProof/>
                     <w:webHidden/>
                   </w:rPr>
-                  <w:instrText xml:space="preserve"> PAGEREF _Toc232003158 \h </w:instrText>
+                  <w:instrText xml:space="preserve"> PAGEREF _Toc232163454 \h </w:instrText>
                 </w:r>
                 <w:r>
                   <w:rPr>
@@ -1520,10 +1525,10 @@
                   <w:noProof/>
                   <w:sz w:val="24"/>
                   <w:szCs w:val="24"/>
-                  <w:lang w:eastAsia="en-GB"/>
+                  <w:lang w:eastAsia="en-AU"/>
                 </w:rPr>
               </w:pPr>
-              <w:hyperlink w:anchor="_Toc232003159" w:history="1">
+              <w:hyperlink w:anchor="_Toc232163455" w:history="1">
                 <w:r>
                   <w:rPr>
                     <w:rStyle w:val="Hyperlink"/>
@@ -1537,7 +1542,7 @@
                     <w:noProof/>
                     <w:sz w:val="24"/>
                     <w:szCs w:val="24"/>
-                    <w:lang w:eastAsia="en-GB"/>
+                    <w:lang w:eastAsia="en-AU"/>
                   </w:rPr>
                   <w:tab/>
                 </w:r>
@@ -1567,7 +1572,7 @@
                     <w:noProof/>
                     <w:webHidden/>
                   </w:rPr>
-                  <w:instrText xml:space="preserve"> PAGEREF _Toc232003159 \h </w:instrText>
+                  <w:instrText xml:space="preserve"> PAGEREF _Toc232163455 \h </w:instrText>
                 </w:r>
                 <w:r>
                   <w:rPr>
@@ -1610,10 +1615,10 @@
                   <w:noProof/>
                   <w:sz w:val="24"/>
                   <w:szCs w:val="24"/>
-                  <w:lang w:eastAsia="en-GB"/>
+                  <w:lang w:eastAsia="en-AU"/>
                 </w:rPr>
               </w:pPr>
-              <w:hyperlink w:anchor="_Toc232003160" w:history="1">
+              <w:hyperlink w:anchor="_Toc232163456" w:history="1">
                 <w:r>
                   <w:rPr>
                     <w:rStyle w:val="Hyperlink"/>
@@ -1627,7 +1632,7 @@
                     <w:noProof/>
                     <w:sz w:val="24"/>
                     <w:szCs w:val="24"/>
-                    <w:lang w:eastAsia="en-GB"/>
+                    <w:lang w:eastAsia="en-AU"/>
                   </w:rPr>
                   <w:tab/>
                 </w:r>
@@ -1657,7 +1662,7 @@
                     <w:noProof/>
                     <w:webHidden/>
                   </w:rPr>
-                  <w:instrText xml:space="preserve"> PAGEREF _Toc232003160 \h </w:instrText>
+                  <w:instrText xml:space="preserve"> PAGEREF _Toc232163456 \h </w:instrText>
                 </w:r>
                 <w:r>
                   <w:rPr>
@@ -1700,10 +1705,10 @@
                   <w:noProof/>
                   <w:sz w:val="24"/>
                   <w:szCs w:val="24"/>
-                  <w:lang w:eastAsia="en-GB"/>
+                  <w:lang w:eastAsia="en-AU"/>
                 </w:rPr>
               </w:pPr>
-              <w:hyperlink w:anchor="_Toc232003161" w:history="1">
+              <w:hyperlink w:anchor="_Toc232163457" w:history="1">
                 <w:r>
                   <w:rPr>
                     <w:rStyle w:val="Hyperlink"/>
@@ -1717,7 +1722,7 @@
                     <w:noProof/>
                     <w:sz w:val="24"/>
                     <w:szCs w:val="24"/>
-                    <w:lang w:eastAsia="en-GB"/>
+                    <w:lang w:eastAsia="en-AU"/>
                   </w:rPr>
                   <w:tab/>
                 </w:r>
@@ -1747,7 +1752,7 @@
                     <w:noProof/>
                     <w:webHidden/>
                   </w:rPr>
-                  <w:instrText xml:space="preserve"> PAGEREF _Toc232003161 \h </w:instrText>
+                  <w:instrText xml:space="preserve"> PAGEREF _Toc232163457 \h </w:instrText>
                 </w:r>
                 <w:r>
                   <w:rPr>
@@ -1790,10 +1795,10 @@
                   <w:noProof/>
                   <w:sz w:val="24"/>
                   <w:szCs w:val="24"/>
-                  <w:lang w:eastAsia="en-GB"/>
+                  <w:lang w:eastAsia="en-AU"/>
                 </w:rPr>
               </w:pPr>
-              <w:hyperlink w:anchor="_Toc232003162" w:history="1">
+              <w:hyperlink w:anchor="_Toc232163458" w:history="1">
                 <w:r>
                   <w:rPr>
                     <w:rStyle w:val="Hyperlink"/>
@@ -1807,7 +1812,7 @@
                     <w:noProof/>
                     <w:sz w:val="24"/>
                     <w:szCs w:val="24"/>
-                    <w:lang w:eastAsia="en-GB"/>
+                    <w:lang w:eastAsia="en-AU"/>
                   </w:rPr>
                   <w:tab/>
                 </w:r>
@@ -1837,7 +1842,7 @@
                     <w:noProof/>
                     <w:webHidden/>
                   </w:rPr>
-                  <w:instrText xml:space="preserve"> PAGEREF _Toc232003162 \h </w:instrText>
+                  <w:instrText xml:space="preserve"> PAGEREF _Toc232163458 \h </w:instrText>
                 </w:r>
                 <w:r>
                   <w:rPr>
@@ -1880,10 +1885,10 @@
                   <w:noProof/>
                   <w:sz w:val="24"/>
                   <w:szCs w:val="24"/>
-                  <w:lang w:eastAsia="en-GB"/>
+                  <w:lang w:eastAsia="en-AU"/>
                 </w:rPr>
               </w:pPr>
-              <w:hyperlink w:anchor="_Toc232003163" w:history="1">
+              <w:hyperlink w:anchor="_Toc232163459" w:history="1">
                 <w:r>
                   <w:rPr>
                     <w:rStyle w:val="Hyperlink"/>
@@ -1897,7 +1902,7 @@
                     <w:noProof/>
                     <w:sz w:val="24"/>
                     <w:szCs w:val="24"/>
-                    <w:lang w:eastAsia="en-GB"/>
+                    <w:lang w:eastAsia="en-AU"/>
                   </w:rPr>
                   <w:tab/>
                 </w:r>
@@ -1927,7 +1932,7 @@
                     <w:noProof/>
                     <w:webHidden/>
                   </w:rPr>
-                  <w:instrText xml:space="preserve"> PAGEREF _Toc232003163 \h </w:instrText>
+                  <w:instrText xml:space="preserve"> PAGEREF _Toc232163459 \h </w:instrText>
                 </w:r>
                 <w:r>
                   <w:rPr>
@@ -1970,10 +1975,10 @@
                   <w:noProof/>
                   <w:sz w:val="24"/>
                   <w:szCs w:val="24"/>
-                  <w:lang w:eastAsia="en-GB"/>
+                  <w:lang w:eastAsia="en-AU"/>
                 </w:rPr>
               </w:pPr>
-              <w:hyperlink w:anchor="_Toc232003164" w:history="1">
+              <w:hyperlink w:anchor="_Toc232163460" w:history="1">
                 <w:r>
                   <w:rPr>
                     <w:rStyle w:val="Hyperlink"/>
@@ -1988,7 +1993,7 @@
                     <w:noProof/>
                     <w:sz w:val="24"/>
                     <w:szCs w:val="24"/>
-                    <w:lang w:eastAsia="en-GB"/>
+                    <w:lang w:eastAsia="en-AU"/>
                   </w:rPr>
                   <w:tab/>
                 </w:r>
@@ -2019,7 +2024,7 @@
                     <w:noProof/>
                     <w:webHidden/>
                   </w:rPr>
-                  <w:instrText xml:space="preserve"> PAGEREF _Toc232003164 \h </w:instrText>
+                  <w:instrText xml:space="preserve"> PAGEREF _Toc232163460 \h </w:instrText>
                 </w:r>
                 <w:r>
                   <w:rPr>
@@ -2062,10 +2067,10 @@
                   <w:noProof/>
                   <w:sz w:val="24"/>
                   <w:szCs w:val="24"/>
-                  <w:lang w:eastAsia="en-GB"/>
+                  <w:lang w:eastAsia="en-AU"/>
                 </w:rPr>
               </w:pPr>
-              <w:hyperlink w:anchor="_Toc232003165" w:history="1">
+              <w:hyperlink w:anchor="_Toc232163461" w:history="1">
                 <w:r>
                   <w:rPr>
                     <w:rStyle w:val="Hyperlink"/>
@@ -2079,7 +2084,7 @@
                     <w:noProof/>
                     <w:sz w:val="24"/>
                     <w:szCs w:val="24"/>
-                    <w:lang w:eastAsia="en-GB"/>
+                    <w:lang w:eastAsia="en-AU"/>
                   </w:rPr>
                   <w:tab/>
                 </w:r>
@@ -2109,7 +2114,7 @@
                     <w:noProof/>
                     <w:webHidden/>
                   </w:rPr>
-                  <w:instrText xml:space="preserve"> PAGEREF _Toc232003165 \h </w:instrText>
+                  <w:instrText xml:space="preserve"> PAGEREF _Toc232163461 \h </w:instrText>
                 </w:r>
                 <w:r>
                   <w:rPr>
@@ -2152,10 +2157,10 @@
                   <w:noProof/>
                   <w:sz w:val="24"/>
                   <w:szCs w:val="24"/>
-                  <w:lang w:eastAsia="en-GB"/>
+                  <w:lang w:eastAsia="en-AU"/>
                 </w:rPr>
               </w:pPr>
-              <w:hyperlink w:anchor="_Toc232003166" w:history="1">
+              <w:hyperlink w:anchor="_Toc232163462" w:history="1">
                 <w:r>
                   <w:rPr>
                     <w:rStyle w:val="Hyperlink"/>
@@ -2169,7 +2174,7 @@
                     <w:noProof/>
                     <w:sz w:val="24"/>
                     <w:szCs w:val="24"/>
-                    <w:lang w:eastAsia="en-GB"/>
+                    <w:lang w:eastAsia="en-AU"/>
                   </w:rPr>
                   <w:tab/>
                 </w:r>
@@ -2199,7 +2204,7 @@
                     <w:noProof/>
                     <w:webHidden/>
                   </w:rPr>
-                  <w:instrText xml:space="preserve"> PAGEREF _Toc232003166 \h </w:instrText>
+                  <w:instrText xml:space="preserve"> PAGEREF _Toc232163462 \h </w:instrText>
                 </w:r>
                 <w:r>
                   <w:rPr>
@@ -2242,10 +2247,10 @@
                   <w:noProof/>
                   <w:sz w:val="24"/>
                   <w:szCs w:val="24"/>
-                  <w:lang w:eastAsia="en-GB"/>
+                  <w:lang w:eastAsia="en-AU"/>
                 </w:rPr>
               </w:pPr>
-              <w:hyperlink w:anchor="_Toc232003167" w:history="1">
+              <w:hyperlink w:anchor="_Toc232163463" w:history="1">
                 <w:r>
                   <w:rPr>
                     <w:rStyle w:val="Hyperlink"/>
@@ -2259,7 +2264,7 @@
                     <w:noProof/>
                     <w:sz w:val="24"/>
                     <w:szCs w:val="24"/>
-                    <w:lang w:eastAsia="en-GB"/>
+                    <w:lang w:eastAsia="en-AU"/>
                   </w:rPr>
                   <w:tab/>
                 </w:r>
@@ -2289,7 +2294,7 @@
                     <w:noProof/>
                     <w:webHidden/>
                   </w:rPr>
-                  <w:instrText xml:space="preserve"> PAGEREF _Toc232003167 \h </w:instrText>
+                  <w:instrText xml:space="preserve"> PAGEREF _Toc232163463 \h </w:instrText>
                 </w:r>
                 <w:r>
                   <w:rPr>
@@ -2332,10 +2337,10 @@
                   <w:noProof/>
                   <w:sz w:val="24"/>
                   <w:szCs w:val="24"/>
-                  <w:lang w:eastAsia="en-GB"/>
+                  <w:lang w:eastAsia="en-AU"/>
                 </w:rPr>
               </w:pPr>
-              <w:hyperlink w:anchor="_Toc232003168" w:history="1">
+              <w:hyperlink w:anchor="_Toc232163464" w:history="1">
                 <w:r>
                   <w:rPr>
                     <w:rStyle w:val="Hyperlink"/>
@@ -2349,7 +2354,7 @@
                     <w:noProof/>
                     <w:sz w:val="24"/>
                     <w:szCs w:val="24"/>
-                    <w:lang w:eastAsia="en-GB"/>
+                    <w:lang w:eastAsia="en-AU"/>
                   </w:rPr>
                   <w:tab/>
                 </w:r>
@@ -2379,7 +2384,7 @@
                     <w:noProof/>
                     <w:webHidden/>
                   </w:rPr>
-                  <w:instrText xml:space="preserve"> PAGEREF _Toc232003168 \h </w:instrText>
+                  <w:instrText xml:space="preserve"> PAGEREF _Toc232163464 \h </w:instrText>
                 </w:r>
                 <w:r>
                   <w:rPr>
@@ -2422,10 +2427,10 @@
                   <w:noProof/>
                   <w:sz w:val="24"/>
                   <w:szCs w:val="24"/>
-                  <w:lang w:eastAsia="en-GB"/>
+                  <w:lang w:eastAsia="en-AU"/>
                 </w:rPr>
               </w:pPr>
-              <w:hyperlink w:anchor="_Toc232003169" w:history="1">
+              <w:hyperlink w:anchor="_Toc232163465" w:history="1">
                 <w:r>
                   <w:rPr>
                     <w:rStyle w:val="Hyperlink"/>
@@ -2439,7 +2444,7 @@
                     <w:noProof/>
                     <w:sz w:val="24"/>
                     <w:szCs w:val="24"/>
-                    <w:lang w:eastAsia="en-GB"/>
+                    <w:lang w:eastAsia="en-AU"/>
                   </w:rPr>
                   <w:tab/>
                 </w:r>
@@ -2469,7 +2474,7 @@
                     <w:noProof/>
                     <w:webHidden/>
                   </w:rPr>
-                  <w:instrText xml:space="preserve"> PAGEREF _Toc232003169 \h </w:instrText>
+                  <w:instrText xml:space="preserve"> PAGEREF _Toc232163465 \h </w:instrText>
                 </w:r>
                 <w:r>
                   <w:rPr>
@@ -2512,10 +2517,10 @@
                   <w:noProof/>
                   <w:sz w:val="24"/>
                   <w:szCs w:val="24"/>
-                  <w:lang w:eastAsia="en-GB"/>
+                  <w:lang w:eastAsia="en-AU"/>
                 </w:rPr>
               </w:pPr>
-              <w:hyperlink w:anchor="_Toc232003170" w:history="1">
+              <w:hyperlink w:anchor="_Toc232163466" w:history="1">
                 <w:r>
                   <w:rPr>
                     <w:rStyle w:val="Hyperlink"/>
@@ -2529,7 +2534,7 @@
                     <w:noProof/>
                     <w:sz w:val="24"/>
                     <w:szCs w:val="24"/>
-                    <w:lang w:eastAsia="en-GB"/>
+                    <w:lang w:eastAsia="en-AU"/>
                   </w:rPr>
                   <w:tab/>
                 </w:r>
@@ -2559,7 +2564,7 @@
                     <w:noProof/>
                     <w:webHidden/>
                   </w:rPr>
-                  <w:instrText xml:space="preserve"> PAGEREF _Toc232003170 \h </w:instrText>
+                  <w:instrText xml:space="preserve"> PAGEREF _Toc232163466 \h </w:instrText>
                 </w:r>
                 <w:r>
                   <w:rPr>
@@ -2602,10 +2607,10 @@
                   <w:noProof/>
                   <w:sz w:val="24"/>
                   <w:szCs w:val="24"/>
-                  <w:lang w:eastAsia="en-GB"/>
+                  <w:lang w:eastAsia="en-AU"/>
                 </w:rPr>
               </w:pPr>
-              <w:hyperlink w:anchor="_Toc232003171" w:history="1">
+              <w:hyperlink w:anchor="_Toc232163467" w:history="1">
                 <w:r>
                   <w:rPr>
                     <w:rStyle w:val="Hyperlink"/>
@@ -2619,7 +2624,7 @@
                     <w:noProof/>
                     <w:sz w:val="24"/>
                     <w:szCs w:val="24"/>
-                    <w:lang w:eastAsia="en-GB"/>
+                    <w:lang w:eastAsia="en-AU"/>
                   </w:rPr>
                   <w:tab/>
                 </w:r>
@@ -2649,7 +2654,7 @@
                     <w:noProof/>
                     <w:webHidden/>
                   </w:rPr>
-                  <w:instrText xml:space="preserve"> PAGEREF _Toc232003171 \h </w:instrText>
+                  <w:instrText xml:space="preserve"> PAGEREF _Toc232163467 \h </w:instrText>
                 </w:r>
                 <w:r>
                   <w:rPr>
@@ -2692,10 +2697,10 @@
                   <w:noProof/>
                   <w:sz w:val="24"/>
                   <w:szCs w:val="24"/>
-                  <w:lang w:eastAsia="en-GB"/>
+                  <w:lang w:eastAsia="en-AU"/>
                 </w:rPr>
               </w:pPr>
-              <w:hyperlink w:anchor="_Toc232003172" w:history="1">
+              <w:hyperlink w:anchor="_Toc232163468" w:history="1">
                 <w:r>
                   <w:rPr>
                     <w:rStyle w:val="Hyperlink"/>
@@ -2709,7 +2714,7 @@
                     <w:noProof/>
                     <w:sz w:val="24"/>
                     <w:szCs w:val="24"/>
-                    <w:lang w:eastAsia="en-GB"/>
+                    <w:lang w:eastAsia="en-AU"/>
                   </w:rPr>
                   <w:tab/>
                 </w:r>
@@ -2739,7 +2744,7 @@
                     <w:noProof/>
                     <w:webHidden/>
                   </w:rPr>
-                  <w:instrText xml:space="preserve"> PAGEREF _Toc232003172 \h </w:instrText>
+                  <w:instrText xml:space="preserve"> PAGEREF _Toc232163468 \h </w:instrText>
                 </w:r>
                 <w:r>
                   <w:rPr>
@@ -2782,10 +2787,10 @@
                   <w:noProof/>
                   <w:sz w:val="24"/>
                   <w:szCs w:val="24"/>
-                  <w:lang w:eastAsia="en-GB"/>
+                  <w:lang w:eastAsia="en-AU"/>
                 </w:rPr>
               </w:pPr>
-              <w:hyperlink w:anchor="_Toc232003173" w:history="1">
+              <w:hyperlink w:anchor="_Toc232163469" w:history="1">
                 <w:r>
                   <w:rPr>
                     <w:rStyle w:val="Hyperlink"/>
@@ -2799,7 +2804,7 @@
                     <w:noProof/>
                     <w:sz w:val="24"/>
                     <w:szCs w:val="24"/>
-                    <w:lang w:eastAsia="en-GB"/>
+                    <w:lang w:eastAsia="en-AU"/>
                   </w:rPr>
                   <w:tab/>
                 </w:r>
@@ -2829,7 +2834,7 @@
                     <w:noProof/>
                     <w:webHidden/>
                   </w:rPr>
-                  <w:instrText xml:space="preserve"> PAGEREF _Toc232003173 \h </w:instrText>
+                  <w:instrText xml:space="preserve"> PAGEREF _Toc232163469 \h </w:instrText>
                 </w:r>
                 <w:r>
                   <w:rPr>
@@ -2872,10 +2877,10 @@
                   <w:noProof/>
                   <w:sz w:val="24"/>
                   <w:szCs w:val="24"/>
-                  <w:lang w:eastAsia="en-GB"/>
+                  <w:lang w:eastAsia="en-AU"/>
                 </w:rPr>
               </w:pPr>
-              <w:hyperlink w:anchor="_Toc232003174" w:history="1">
+              <w:hyperlink w:anchor="_Toc232163470" w:history="1">
                 <w:r>
                   <w:rPr>
                     <w:rStyle w:val="Hyperlink"/>
@@ -2889,7 +2894,7 @@
                     <w:noProof/>
                     <w:sz w:val="24"/>
                     <w:szCs w:val="24"/>
-                    <w:lang w:eastAsia="en-GB"/>
+                    <w:lang w:eastAsia="en-AU"/>
                   </w:rPr>
                   <w:tab/>
                 </w:r>
@@ -2919,7 +2924,7 @@
                     <w:noProof/>
                     <w:webHidden/>
                   </w:rPr>
-                  <w:instrText xml:space="preserve"> PAGEREF _Toc232003174 \h </w:instrText>
+                  <w:instrText xml:space="preserve"> PAGEREF _Toc232163470 \h </w:instrText>
                 </w:r>
                 <w:r>
                   <w:rPr>
@@ -2962,10 +2967,10 @@
                   <w:noProof/>
                   <w:sz w:val="24"/>
                   <w:szCs w:val="24"/>
-                  <w:lang w:eastAsia="en-GB"/>
+                  <w:lang w:eastAsia="en-AU"/>
                 </w:rPr>
               </w:pPr>
-              <w:hyperlink w:anchor="_Toc232003175" w:history="1">
+              <w:hyperlink w:anchor="_Toc232163471" w:history="1">
                 <w:r>
                   <w:rPr>
                     <w:rStyle w:val="Hyperlink"/>
@@ -2979,7 +2984,7 @@
                     <w:noProof/>
                     <w:sz w:val="24"/>
                     <w:szCs w:val="24"/>
-                    <w:lang w:eastAsia="en-GB"/>
+                    <w:lang w:eastAsia="en-AU"/>
                   </w:rPr>
                   <w:tab/>
                 </w:r>
@@ -3009,7 +3014,7 @@
                     <w:noProof/>
                     <w:webHidden/>
                   </w:rPr>
-                  <w:instrText xml:space="preserve"> PAGEREF _Toc232003175 \h </w:instrText>
+                  <w:instrText xml:space="preserve"> PAGEREF _Toc232163471 \h </w:instrText>
                 </w:r>
                 <w:r>
                   <w:rPr>
@@ -3052,10 +3057,10 @@
                   <w:noProof/>
                   <w:sz w:val="24"/>
                   <w:szCs w:val="24"/>
-                  <w:lang w:eastAsia="en-GB"/>
+                  <w:lang w:eastAsia="en-AU"/>
                 </w:rPr>
               </w:pPr>
-              <w:hyperlink w:anchor="_Toc232003176" w:history="1">
+              <w:hyperlink w:anchor="_Toc232163472" w:history="1">
                 <w:r>
                   <w:rPr>
                     <w:rStyle w:val="Hyperlink"/>
@@ -3069,7 +3074,7 @@
                     <w:noProof/>
                     <w:sz w:val="24"/>
                     <w:szCs w:val="24"/>
-                    <w:lang w:eastAsia="en-GB"/>
+                    <w:lang w:eastAsia="en-AU"/>
                   </w:rPr>
                   <w:tab/>
                 </w:r>
@@ -3099,7 +3104,7 @@
                     <w:noProof/>
                     <w:webHidden/>
                   </w:rPr>
-                  <w:instrText xml:space="preserve"> PAGEREF _Toc232003176 \h </w:instrText>
+                  <w:instrText xml:space="preserve"> PAGEREF _Toc232163472 \h </w:instrText>
                 </w:r>
                 <w:r>
                   <w:rPr>
@@ -3142,10 +3147,10 @@
                   <w:noProof/>
                   <w:sz w:val="24"/>
                   <w:szCs w:val="24"/>
-                  <w:lang w:eastAsia="en-GB"/>
+                  <w:lang w:eastAsia="en-AU"/>
                 </w:rPr>
               </w:pPr>
-              <w:hyperlink w:anchor="_Toc232003177" w:history="1">
+              <w:hyperlink w:anchor="_Toc232163473" w:history="1">
                 <w:r>
                   <w:rPr>
                     <w:rStyle w:val="Hyperlink"/>
@@ -3159,7 +3164,7 @@
                     <w:noProof/>
                     <w:sz w:val="24"/>
                     <w:szCs w:val="24"/>
-                    <w:lang w:eastAsia="en-GB"/>
+                    <w:lang w:eastAsia="en-AU"/>
                   </w:rPr>
                   <w:tab/>
                 </w:r>
@@ -3189,7 +3194,7 @@
                     <w:noProof/>
                     <w:webHidden/>
                   </w:rPr>
-                  <w:instrText xml:space="preserve"> PAGEREF _Toc232003177 \h </w:instrText>
+                  <w:instrText xml:space="preserve"> PAGEREF _Toc232163473 \h </w:instrText>
                 </w:r>
                 <w:r>
                   <w:rPr>
@@ -3232,10 +3237,10 @@
                   <w:noProof/>
                   <w:sz w:val="24"/>
                   <w:szCs w:val="24"/>
-                  <w:lang w:eastAsia="en-GB"/>
+                  <w:lang w:eastAsia="en-AU"/>
                 </w:rPr>
               </w:pPr>
-              <w:hyperlink w:anchor="_Toc232003178" w:history="1">
+              <w:hyperlink w:anchor="_Toc232163474" w:history="1">
                 <w:r>
                   <w:rPr>
                     <w:rStyle w:val="Hyperlink"/>
@@ -3249,7 +3254,7 @@
                     <w:noProof/>
                     <w:sz w:val="24"/>
                     <w:szCs w:val="24"/>
-                    <w:lang w:eastAsia="en-GB"/>
+                    <w:lang w:eastAsia="en-AU"/>
                   </w:rPr>
                   <w:tab/>
                 </w:r>
@@ -3279,7 +3284,7 @@
                     <w:noProof/>
                     <w:webHidden/>
                   </w:rPr>
-                  <w:instrText xml:space="preserve"> PAGEREF _Toc232003178 \h </w:instrText>
+                  <w:instrText xml:space="preserve"> PAGEREF _Toc232163474 \h </w:instrText>
                 </w:r>
                 <w:r>
                   <w:rPr>
@@ -3322,10 +3327,10 @@
                   <w:noProof/>
                   <w:sz w:val="24"/>
                   <w:szCs w:val="24"/>
-                  <w:lang w:eastAsia="en-GB"/>
+                  <w:lang w:eastAsia="en-AU"/>
                 </w:rPr>
               </w:pPr>
-              <w:hyperlink w:anchor="_Toc232003179" w:history="1">
+              <w:hyperlink w:anchor="_Toc232163475" w:history="1">
                 <w:r>
                   <w:rPr>
                     <w:rStyle w:val="Hyperlink"/>
@@ -3339,7 +3344,7 @@
                     <w:noProof/>
                     <w:sz w:val="24"/>
                     <w:szCs w:val="24"/>
-                    <w:lang w:eastAsia="en-GB"/>
+                    <w:lang w:eastAsia="en-AU"/>
                   </w:rPr>
                   <w:tab/>
                 </w:r>
@@ -3369,7 +3374,7 @@
                     <w:noProof/>
                     <w:webHidden/>
                   </w:rPr>
-                  <w:instrText xml:space="preserve"> PAGEREF _Toc232003179 \h </w:instrText>
+                  <w:instrText xml:space="preserve"> PAGEREF _Toc232163475 \h </w:instrText>
                 </w:r>
                 <w:r>
                   <w:rPr>
@@ -3412,10 +3417,10 @@
                   <w:noProof/>
                   <w:sz w:val="24"/>
                   <w:szCs w:val="24"/>
-                  <w:lang w:eastAsia="en-GB"/>
+                  <w:lang w:eastAsia="en-AU"/>
                 </w:rPr>
               </w:pPr>
-              <w:hyperlink w:anchor="_Toc232003180" w:history="1">
+              <w:hyperlink w:anchor="_Toc232163476" w:history="1">
                 <w:r>
                   <w:rPr>
                     <w:rStyle w:val="Hyperlink"/>
@@ -3429,7 +3434,7 @@
                     <w:noProof/>
                     <w:sz w:val="24"/>
                     <w:szCs w:val="24"/>
-                    <w:lang w:eastAsia="en-GB"/>
+                    <w:lang w:eastAsia="en-AU"/>
                   </w:rPr>
                   <w:tab/>
                 </w:r>
@@ -3459,7 +3464,7 @@
                     <w:noProof/>
                     <w:webHidden/>
                   </w:rPr>
-                  <w:instrText xml:space="preserve"> PAGEREF _Toc232003180 \h </w:instrText>
+                  <w:instrText xml:space="preserve"> PAGEREF _Toc232163476 \h </w:instrText>
                 </w:r>
                 <w:r>
                   <w:rPr>
@@ -3502,10 +3507,10 @@
                   <w:noProof/>
                   <w:sz w:val="24"/>
                   <w:szCs w:val="24"/>
-                  <w:lang w:eastAsia="en-GB"/>
+                  <w:lang w:eastAsia="en-AU"/>
                 </w:rPr>
               </w:pPr>
-              <w:hyperlink w:anchor="_Toc232003181" w:history="1">
+              <w:hyperlink w:anchor="_Toc232163477" w:history="1">
                 <w:r>
                   <w:rPr>
                     <w:rStyle w:val="Hyperlink"/>
@@ -3519,7 +3524,7 @@
                     <w:noProof/>
                     <w:sz w:val="24"/>
                     <w:szCs w:val="24"/>
-                    <w:lang w:eastAsia="en-GB"/>
+                    <w:lang w:eastAsia="en-AU"/>
                   </w:rPr>
                   <w:tab/>
                 </w:r>
@@ -3549,7 +3554,7 @@
                     <w:noProof/>
                     <w:webHidden/>
                   </w:rPr>
-                  <w:instrText xml:space="preserve"> PAGEREF _Toc232003181 \h </w:instrText>
+                  <w:instrText xml:space="preserve"> PAGEREF _Toc232163477 \h </w:instrText>
                 </w:r>
                 <w:r>
                   <w:rPr>
@@ -3592,10 +3597,10 @@
                   <w:noProof/>
                   <w:sz w:val="24"/>
                   <w:szCs w:val="24"/>
-                  <w:lang w:eastAsia="en-GB"/>
+                  <w:lang w:eastAsia="en-AU"/>
                 </w:rPr>
               </w:pPr>
-              <w:hyperlink w:anchor="_Toc232003182" w:history="1">
+              <w:hyperlink w:anchor="_Toc232163478" w:history="1">
                 <w:r>
                   <w:rPr>
                     <w:rStyle w:val="Hyperlink"/>
@@ -3609,7 +3614,7 @@
                     <w:noProof/>
                     <w:sz w:val="24"/>
                     <w:szCs w:val="24"/>
-                    <w:lang w:eastAsia="en-GB"/>
+                    <w:lang w:eastAsia="en-AU"/>
                   </w:rPr>
                   <w:tab/>
                 </w:r>
@@ -3639,7 +3644,7 @@
                     <w:noProof/>
                     <w:webHidden/>
                   </w:rPr>
-                  <w:instrText xml:space="preserve"> PAGEREF _Toc232003182 \h </w:instrText>
+                  <w:instrText xml:space="preserve"> PAGEREF _Toc232163478 \h </w:instrText>
                 </w:r>
                 <w:r>
                   <w:rPr>
@@ -3682,10 +3687,10 @@
                   <w:noProof/>
                   <w:sz w:val="24"/>
                   <w:szCs w:val="24"/>
-                  <w:lang w:eastAsia="en-GB"/>
+                  <w:lang w:eastAsia="en-AU"/>
                 </w:rPr>
               </w:pPr>
-              <w:hyperlink w:anchor="_Toc232003183" w:history="1">
+              <w:hyperlink w:anchor="_Toc232163479" w:history="1">
                 <w:r>
                   <w:rPr>
                     <w:rStyle w:val="Hyperlink"/>
@@ -3699,7 +3704,7 @@
                     <w:noProof/>
                     <w:sz w:val="24"/>
                     <w:szCs w:val="24"/>
-                    <w:lang w:eastAsia="en-GB"/>
+                    <w:lang w:eastAsia="en-AU"/>
                   </w:rPr>
                   <w:tab/>
                 </w:r>
@@ -3729,7 +3734,7 @@
                     <w:noProof/>
                     <w:webHidden/>
                   </w:rPr>
-                  <w:instrText xml:space="preserve"> PAGEREF _Toc232003183 \h </w:instrText>
+                  <w:instrText xml:space="preserve"> PAGEREF _Toc232163479 \h </w:instrText>
                 </w:r>
                 <w:r>
                   <w:rPr>
@@ -3772,10 +3777,10 @@
                   <w:noProof/>
                   <w:sz w:val="24"/>
                   <w:szCs w:val="24"/>
-                  <w:lang w:eastAsia="en-GB"/>
+                  <w:lang w:eastAsia="en-AU"/>
                 </w:rPr>
               </w:pPr>
-              <w:hyperlink w:anchor="_Toc232003184" w:history="1">
+              <w:hyperlink w:anchor="_Toc232163480" w:history="1">
                 <w:r>
                   <w:rPr>
                     <w:rStyle w:val="Hyperlink"/>
@@ -3789,7 +3794,7 @@
                     <w:noProof/>
                     <w:sz w:val="24"/>
                     <w:szCs w:val="24"/>
-                    <w:lang w:eastAsia="en-GB"/>
+                    <w:lang w:eastAsia="en-AU"/>
                   </w:rPr>
                   <w:tab/>
                 </w:r>
@@ -3819,7 +3824,7 @@
                     <w:noProof/>
                     <w:webHidden/>
                   </w:rPr>
-                  <w:instrText xml:space="preserve"> PAGEREF _Toc232003184 \h </w:instrText>
+                  <w:instrText xml:space="preserve"> PAGEREF _Toc232163480 \h </w:instrText>
                 </w:r>
                 <w:r>
                   <w:rPr>
@@ -3862,10 +3867,10 @@
                   <w:noProof/>
                   <w:sz w:val="24"/>
                   <w:szCs w:val="24"/>
-                  <w:lang w:eastAsia="en-GB"/>
+                  <w:lang w:eastAsia="en-AU"/>
                 </w:rPr>
               </w:pPr>
-              <w:hyperlink w:anchor="_Toc232003185" w:history="1">
+              <w:hyperlink w:anchor="_Toc232163481" w:history="1">
                 <w:r>
                   <w:rPr>
                     <w:rStyle w:val="Hyperlink"/>
@@ -3879,7 +3884,7 @@
                     <w:noProof/>
                     <w:sz w:val="24"/>
                     <w:szCs w:val="24"/>
-                    <w:lang w:eastAsia="en-GB"/>
+                    <w:lang w:eastAsia="en-AU"/>
                   </w:rPr>
                   <w:tab/>
                 </w:r>
@@ -3909,7 +3914,7 @@
                     <w:noProof/>
                     <w:webHidden/>
                   </w:rPr>
-                  <w:instrText xml:space="preserve"> PAGEREF _Toc232003185 \h </w:instrText>
+                  <w:instrText xml:space="preserve"> PAGEREF _Toc232163481 \h </w:instrText>
                 </w:r>
                 <w:r>
                   <w:rPr>
@@ -3952,10 +3957,10 @@
                   <w:noProof/>
                   <w:sz w:val="24"/>
                   <w:szCs w:val="24"/>
-                  <w:lang w:eastAsia="en-GB"/>
+                  <w:lang w:eastAsia="en-AU"/>
                 </w:rPr>
               </w:pPr>
-              <w:hyperlink w:anchor="_Toc232003186" w:history="1">
+              <w:hyperlink w:anchor="_Toc232163482" w:history="1">
                 <w:r>
                   <w:rPr>
                     <w:rStyle w:val="Hyperlink"/>
@@ -3969,7 +3974,7 @@
                     <w:noProof/>
                     <w:sz w:val="24"/>
                     <w:szCs w:val="24"/>
-                    <w:lang w:eastAsia="en-GB"/>
+                    <w:lang w:eastAsia="en-AU"/>
                   </w:rPr>
                   <w:tab/>
                 </w:r>
@@ -3999,7 +4004,7 @@
                     <w:noProof/>
                     <w:webHidden/>
                   </w:rPr>
-                  <w:instrText xml:space="preserve"> PAGEREF _Toc232003186 \h </w:instrText>
+                  <w:instrText xml:space="preserve"> PAGEREF _Toc232163482 \h </w:instrText>
                 </w:r>
                 <w:r>
                   <w:rPr>
@@ -4042,10 +4047,10 @@
                   <w:noProof/>
                   <w:sz w:val="24"/>
                   <w:szCs w:val="24"/>
-                  <w:lang w:eastAsia="en-GB"/>
+                  <w:lang w:eastAsia="en-AU"/>
                 </w:rPr>
               </w:pPr>
-              <w:hyperlink w:anchor="_Toc232003187" w:history="1">
+              <w:hyperlink w:anchor="_Toc232163483" w:history="1">
                 <w:r>
                   <w:rPr>
                     <w:rStyle w:val="Hyperlink"/>
@@ -4060,7 +4065,7 @@
                     <w:noProof/>
                     <w:sz w:val="24"/>
                     <w:szCs w:val="24"/>
-                    <w:lang w:eastAsia="en-GB"/>
+                    <w:lang w:eastAsia="en-AU"/>
                   </w:rPr>
                   <w:tab/>
                 </w:r>
@@ -4091,7 +4096,7 @@
                     <w:noProof/>
                     <w:webHidden/>
                   </w:rPr>
-                  <w:instrText xml:space="preserve"> PAGEREF _Toc232003187 \h </w:instrText>
+                  <w:instrText xml:space="preserve"> PAGEREF _Toc232163483 \h </w:instrText>
                 </w:r>
                 <w:r>
                   <w:rPr>
@@ -4134,10 +4139,10 @@
                   <w:noProof/>
                   <w:sz w:val="24"/>
                   <w:szCs w:val="24"/>
-                  <w:lang w:eastAsia="en-GB"/>
+                  <w:lang w:eastAsia="en-AU"/>
                 </w:rPr>
               </w:pPr>
-              <w:hyperlink w:anchor="_Toc232003188" w:history="1">
+              <w:hyperlink w:anchor="_Toc232163484" w:history="1">
                 <w:r>
                   <w:rPr>
                     <w:rStyle w:val="Hyperlink"/>
@@ -4151,7 +4156,7 @@
                     <w:noProof/>
                     <w:sz w:val="24"/>
                     <w:szCs w:val="24"/>
-                    <w:lang w:eastAsia="en-GB"/>
+                    <w:lang w:eastAsia="en-AU"/>
                   </w:rPr>
                   <w:tab/>
                 </w:r>
@@ -4181,7 +4186,7 @@
                     <w:noProof/>
                     <w:webHidden/>
                   </w:rPr>
-                  <w:instrText xml:space="preserve"> PAGEREF _Toc232003188 \h </w:instrText>
+                  <w:instrText xml:space="preserve"> PAGEREF _Toc232163484 \h </w:instrText>
                 </w:r>
                 <w:r>
                   <w:rPr>
@@ -4224,10 +4229,10 @@
                   <w:noProof/>
                   <w:sz w:val="24"/>
                   <w:szCs w:val="24"/>
-                  <w:lang w:eastAsia="en-GB"/>
+                  <w:lang w:eastAsia="en-AU"/>
                 </w:rPr>
               </w:pPr>
-              <w:hyperlink w:anchor="_Toc232003189" w:history="1">
+              <w:hyperlink w:anchor="_Toc232163485" w:history="1">
                 <w:r>
                   <w:rPr>
                     <w:rStyle w:val="Hyperlink"/>
@@ -4241,7 +4246,7 @@
                     <w:noProof/>
                     <w:sz w:val="24"/>
                     <w:szCs w:val="24"/>
-                    <w:lang w:eastAsia="en-GB"/>
+                    <w:lang w:eastAsia="en-AU"/>
                   </w:rPr>
                   <w:tab/>
                 </w:r>
@@ -4271,7 +4276,7 @@
                     <w:noProof/>
                     <w:webHidden/>
                   </w:rPr>
-                  <w:instrText xml:space="preserve"> PAGEREF _Toc232003189 \h </w:instrText>
+                  <w:instrText xml:space="preserve"> PAGEREF _Toc232163485 \h </w:instrText>
                 </w:r>
                 <w:r>
                   <w:rPr>
@@ -4314,10 +4319,10 @@
                   <w:noProof/>
                   <w:sz w:val="24"/>
                   <w:szCs w:val="24"/>
-                  <w:lang w:eastAsia="en-GB"/>
+                  <w:lang w:eastAsia="en-AU"/>
                 </w:rPr>
               </w:pPr>
-              <w:hyperlink w:anchor="_Toc232003190" w:history="1">
+              <w:hyperlink w:anchor="_Toc232163486" w:history="1">
                 <w:r>
                   <w:rPr>
                     <w:rStyle w:val="Hyperlink"/>
@@ -4332,7 +4337,7 @@
                     <w:noProof/>
                     <w:sz w:val="24"/>
                     <w:szCs w:val="24"/>
-                    <w:lang w:eastAsia="en-GB"/>
+                    <w:lang w:eastAsia="en-AU"/>
                   </w:rPr>
                   <w:tab/>
                 </w:r>
@@ -4363,7 +4368,7 @@
                     <w:noProof/>
                     <w:webHidden/>
                   </w:rPr>
-                  <w:instrText xml:space="preserve"> PAGEREF _Toc232003190 \h </w:instrText>
+                  <w:instrText xml:space="preserve"> PAGEREF _Toc232163486 \h </w:instrText>
                 </w:r>
                 <w:r>
                   <w:rPr>
@@ -4406,10 +4411,10 @@
                   <w:noProof/>
                   <w:sz w:val="24"/>
                   <w:szCs w:val="24"/>
-                  <w:lang w:eastAsia="en-GB"/>
+                  <w:lang w:eastAsia="en-AU"/>
                 </w:rPr>
               </w:pPr>
-              <w:hyperlink w:anchor="_Toc232003191" w:history="1">
+              <w:hyperlink w:anchor="_Toc232163487" w:history="1">
                 <w:r>
                   <w:rPr>
                     <w:rStyle w:val="Hyperlink"/>
@@ -4423,7 +4428,7 @@
                     <w:noProof/>
                     <w:sz w:val="24"/>
                     <w:szCs w:val="24"/>
-                    <w:lang w:eastAsia="en-GB"/>
+                    <w:lang w:eastAsia="en-AU"/>
                   </w:rPr>
                   <w:tab/>
                 </w:r>
@@ -4453,7 +4458,7 @@
                     <w:noProof/>
                     <w:webHidden/>
                   </w:rPr>
-                  <w:instrText xml:space="preserve"> PAGEREF _Toc232003191 \h </w:instrText>
+                  <w:instrText xml:space="preserve"> PAGEREF _Toc232163487 \h </w:instrText>
                 </w:r>
                 <w:r>
                   <w:rPr>
@@ -4496,10 +4501,10 @@
                   <w:noProof/>
                   <w:sz w:val="24"/>
                   <w:szCs w:val="24"/>
-                  <w:lang w:eastAsia="en-GB"/>
+                  <w:lang w:eastAsia="en-AU"/>
                 </w:rPr>
               </w:pPr>
-              <w:hyperlink w:anchor="_Toc232003192" w:history="1">
+              <w:hyperlink w:anchor="_Toc232163488" w:history="1">
                 <w:r>
                   <w:rPr>
                     <w:rStyle w:val="Hyperlink"/>
@@ -4513,7 +4518,7 @@
                     <w:noProof/>
                     <w:sz w:val="24"/>
                     <w:szCs w:val="24"/>
-                    <w:lang w:eastAsia="en-GB"/>
+                    <w:lang w:eastAsia="en-AU"/>
                   </w:rPr>
                   <w:tab/>
                 </w:r>
@@ -4543,7 +4548,7 @@
                     <w:noProof/>
                     <w:webHidden/>
                   </w:rPr>
-                  <w:instrText xml:space="preserve"> PAGEREF _Toc232003192 \h </w:instrText>
+                  <w:instrText xml:space="preserve"> PAGEREF _Toc232163488 \h </w:instrText>
                 </w:r>
                 <w:r>
                   <w:rPr>
@@ -4586,10 +4591,10 @@
                   <w:noProof/>
                   <w:sz w:val="24"/>
                   <w:szCs w:val="24"/>
-                  <w:lang w:eastAsia="en-GB"/>
+                  <w:lang w:eastAsia="en-AU"/>
                 </w:rPr>
               </w:pPr>
-              <w:hyperlink w:anchor="_Toc232003193" w:history="1">
+              <w:hyperlink w:anchor="_Toc232163489" w:history="1">
                 <w:r>
                   <w:rPr>
                     <w:rStyle w:val="Hyperlink"/>
@@ -4604,7 +4609,7 @@
                     <w:noProof/>
                     <w:sz w:val="24"/>
                     <w:szCs w:val="24"/>
-                    <w:lang w:eastAsia="en-GB"/>
+                    <w:lang w:eastAsia="en-AU"/>
                   </w:rPr>
                   <w:tab/>
                 </w:r>
@@ -4635,7 +4640,7 @@
                     <w:noProof/>
                     <w:webHidden/>
                   </w:rPr>
-                  <w:instrText xml:space="preserve"> PAGEREF _Toc232003193 \h </w:instrText>
+                  <w:instrText xml:space="preserve"> PAGEREF _Toc232163489 \h </w:instrText>
                 </w:r>
                 <w:r>
                   <w:rPr>
@@ -4678,10 +4683,10 @@
                   <w:noProof/>
                   <w:sz w:val="24"/>
                   <w:szCs w:val="24"/>
-                  <w:lang w:eastAsia="en-GB"/>
+                  <w:lang w:eastAsia="en-AU"/>
                 </w:rPr>
               </w:pPr>
-              <w:hyperlink w:anchor="_Toc232003194" w:history="1">
+              <w:hyperlink w:anchor="_Toc232163490" w:history="1">
                 <w:r>
                   <w:rPr>
                     <w:rStyle w:val="Hyperlink"/>
@@ -4695,7 +4700,7 @@
                     <w:noProof/>
                     <w:sz w:val="24"/>
                     <w:szCs w:val="24"/>
-                    <w:lang w:eastAsia="en-GB"/>
+                    <w:lang w:eastAsia="en-AU"/>
                   </w:rPr>
                   <w:tab/>
                 </w:r>
@@ -4725,7 +4730,7 @@
                     <w:noProof/>
                     <w:webHidden/>
                   </w:rPr>
-                  <w:instrText xml:space="preserve"> PAGEREF _Toc232003194 \h </w:instrText>
+                  <w:instrText xml:space="preserve"> PAGEREF _Toc232163490 \h </w:instrText>
                 </w:r>
                 <w:r>
                   <w:rPr>
@@ -4768,10 +4773,10 @@
                   <w:noProof/>
                   <w:sz w:val="24"/>
                   <w:szCs w:val="24"/>
-                  <w:lang w:eastAsia="en-GB"/>
+                  <w:lang w:eastAsia="en-AU"/>
                 </w:rPr>
               </w:pPr>
-              <w:hyperlink w:anchor="_Toc232003195" w:history="1">
+              <w:hyperlink w:anchor="_Toc232163491" w:history="1">
                 <w:r>
                   <w:rPr>
                     <w:rStyle w:val="Hyperlink"/>
@@ -4786,7 +4791,7 @@
                     <w:noProof/>
                     <w:sz w:val="24"/>
                     <w:szCs w:val="24"/>
-                    <w:lang w:eastAsia="en-GB"/>
+                    <w:lang w:eastAsia="en-AU"/>
                   </w:rPr>
                   <w:tab/>
                 </w:r>
@@ -4817,7 +4822,7 @@
                     <w:noProof/>
                     <w:webHidden/>
                   </w:rPr>
-                  <w:instrText xml:space="preserve"> PAGEREF _Toc232003195 \h </w:instrText>
+                  <w:instrText xml:space="preserve"> PAGEREF _Toc232163491 \h </w:instrText>
                 </w:r>
                 <w:r>
                   <w:rPr>
@@ -4860,10 +4865,10 @@
                   <w:noProof/>
                   <w:sz w:val="24"/>
                   <w:szCs w:val="24"/>
-                  <w:lang w:eastAsia="en-GB"/>
+                  <w:lang w:eastAsia="en-AU"/>
                 </w:rPr>
               </w:pPr>
-              <w:hyperlink w:anchor="_Toc232003196" w:history="1">
+              <w:hyperlink w:anchor="_Toc232163492" w:history="1">
                 <w:r>
                   <w:rPr>
                     <w:rStyle w:val="Hyperlink"/>
@@ -4877,7 +4882,7 @@
                     <w:noProof/>
                     <w:sz w:val="24"/>
                     <w:szCs w:val="24"/>
-                    <w:lang w:eastAsia="en-GB"/>
+                    <w:lang w:eastAsia="en-AU"/>
                   </w:rPr>
                   <w:tab/>
                 </w:r>
@@ -4907,7 +4912,7 @@
                     <w:noProof/>
                     <w:webHidden/>
                   </w:rPr>
-                  <w:instrText xml:space="preserve"> PAGEREF _Toc232003196 \h </w:instrText>
+                  <w:instrText xml:space="preserve"> PAGEREF _Toc232163492 \h </w:instrText>
                 </w:r>
                 <w:r>
                   <w:rPr>
@@ -4950,10 +4955,10 @@
                   <w:noProof/>
                   <w:sz w:val="24"/>
                   <w:szCs w:val="24"/>
-                  <w:lang w:eastAsia="en-GB"/>
+                  <w:lang w:eastAsia="en-AU"/>
                 </w:rPr>
               </w:pPr>
-              <w:hyperlink w:anchor="_Toc232003197" w:history="1">
+              <w:hyperlink w:anchor="_Toc232163493" w:history="1">
                 <w:r>
                   <w:rPr>
                     <w:rStyle w:val="Hyperlink"/>
@@ -4967,7 +4972,7 @@
                     <w:noProof/>
                     <w:sz w:val="24"/>
                     <w:szCs w:val="24"/>
-                    <w:lang w:eastAsia="en-GB"/>
+                    <w:lang w:eastAsia="en-AU"/>
                   </w:rPr>
                   <w:tab/>
                 </w:r>
@@ -4997,7 +5002,7 @@
                     <w:noProof/>
                     <w:webHidden/>
                   </w:rPr>
-                  <w:instrText xml:space="preserve"> PAGEREF _Toc232003197 \h </w:instrText>
+                  <w:instrText xml:space="preserve"> PAGEREF _Toc232163493 \h </w:instrText>
                 </w:r>
                 <w:r>
                   <w:rPr>
@@ -5040,10 +5045,10 @@
                   <w:noProof/>
                   <w:sz w:val="24"/>
                   <w:szCs w:val="24"/>
-                  <w:lang w:eastAsia="en-GB"/>
+                  <w:lang w:eastAsia="en-AU"/>
                 </w:rPr>
               </w:pPr>
-              <w:hyperlink w:anchor="_Toc232003198" w:history="1">
+              <w:hyperlink w:anchor="_Toc232163494" w:history="1">
                 <w:r>
                   <w:rPr>
                     <w:rStyle w:val="Hyperlink"/>
@@ -5057,7 +5062,7 @@
                     <w:noProof/>
                     <w:sz w:val="24"/>
                     <w:szCs w:val="24"/>
-                    <w:lang w:eastAsia="en-GB"/>
+                    <w:lang w:eastAsia="en-AU"/>
                   </w:rPr>
                   <w:tab/>
                 </w:r>
@@ -5087,7 +5092,7 @@
                     <w:noProof/>
                     <w:webHidden/>
                   </w:rPr>
-                  <w:instrText xml:space="preserve"> PAGEREF _Toc232003198 \h </w:instrText>
+                  <w:instrText xml:space="preserve"> PAGEREF _Toc232163494 \h </w:instrText>
                 </w:r>
                 <w:r>
                   <w:rPr>
@@ -5130,10 +5135,10 @@
                   <w:noProof/>
                   <w:sz w:val="24"/>
                   <w:szCs w:val="24"/>
-                  <w:lang w:eastAsia="en-GB"/>
+                  <w:lang w:eastAsia="en-AU"/>
                 </w:rPr>
               </w:pPr>
-              <w:hyperlink w:anchor="_Toc232003199" w:history="1">
+              <w:hyperlink w:anchor="_Toc232163495" w:history="1">
                 <w:r>
                   <w:rPr>
                     <w:rStyle w:val="Hyperlink"/>
@@ -5147,7 +5152,7 @@
                     <w:noProof/>
                     <w:sz w:val="24"/>
                     <w:szCs w:val="24"/>
-                    <w:lang w:eastAsia="en-GB"/>
+                    <w:lang w:eastAsia="en-AU"/>
                   </w:rPr>
                   <w:tab/>
                 </w:r>
@@ -5177,7 +5182,7 @@
                     <w:noProof/>
                     <w:webHidden/>
                   </w:rPr>
-                  <w:instrText xml:space="preserve"> PAGEREF _Toc232003199 \h </w:instrText>
+                  <w:instrText xml:space="preserve"> PAGEREF _Toc232163495 \h </w:instrText>
                 </w:r>
                 <w:r>
                   <w:rPr>
@@ -5220,10 +5225,10 @@
                   <w:noProof/>
                   <w:sz w:val="24"/>
                   <w:szCs w:val="24"/>
-                  <w:lang w:eastAsia="en-GB"/>
+                  <w:lang w:eastAsia="en-AU"/>
                 </w:rPr>
               </w:pPr>
-              <w:hyperlink w:anchor="_Toc232003200" w:history="1">
+              <w:hyperlink w:anchor="_Toc232163496" w:history="1">
                 <w:r>
                   <w:rPr>
                     <w:rStyle w:val="Hyperlink"/>
@@ -5237,7 +5242,7 @@
                     <w:noProof/>
                     <w:sz w:val="24"/>
                     <w:szCs w:val="24"/>
-                    <w:lang w:eastAsia="en-GB"/>
+                    <w:lang w:eastAsia="en-AU"/>
                   </w:rPr>
                   <w:tab/>
                 </w:r>
@@ -5267,7 +5272,7 @@
                     <w:noProof/>
                     <w:webHidden/>
                   </w:rPr>
-                  <w:instrText xml:space="preserve"> PAGEREF _Toc232003200 \h </w:instrText>
+                  <w:instrText xml:space="preserve"> PAGEREF _Toc232163496 \h </w:instrText>
                 </w:r>
                 <w:r>
                   <w:rPr>
@@ -5310,10 +5315,10 @@
                   <w:noProof/>
                   <w:sz w:val="24"/>
                   <w:szCs w:val="24"/>
-                  <w:lang w:eastAsia="en-GB"/>
+                  <w:lang w:eastAsia="en-AU"/>
                 </w:rPr>
               </w:pPr>
-              <w:hyperlink w:anchor="_Toc232003201" w:history="1">
+              <w:hyperlink w:anchor="_Toc232163497" w:history="1">
                 <w:r>
                   <w:rPr>
                     <w:rStyle w:val="Hyperlink"/>
@@ -5327,7 +5332,7 @@
                     <w:noProof/>
                     <w:sz w:val="24"/>
                     <w:szCs w:val="24"/>
-                    <w:lang w:eastAsia="en-GB"/>
+                    <w:lang w:eastAsia="en-AU"/>
                   </w:rPr>
                   <w:tab/>
                 </w:r>
@@ -5357,7 +5362,7 @@
                     <w:noProof/>
                     <w:webHidden/>
                   </w:rPr>
-                  <w:instrText xml:space="preserve"> PAGEREF _Toc232003201 \h </w:instrText>
+                  <w:instrText xml:space="preserve"> PAGEREF _Toc232163497 \h </w:instrText>
                 </w:r>
                 <w:r>
                   <w:rPr>
@@ -5400,10 +5405,10 @@
                   <w:noProof/>
                   <w:sz w:val="24"/>
                   <w:szCs w:val="24"/>
-                  <w:lang w:eastAsia="en-GB"/>
+                  <w:lang w:eastAsia="en-AU"/>
                 </w:rPr>
               </w:pPr>
-              <w:hyperlink w:anchor="_Toc232003202" w:history="1">
+              <w:hyperlink w:anchor="_Toc232163498" w:history="1">
                 <w:r>
                   <w:rPr>
                     <w:rStyle w:val="Hyperlink"/>
@@ -5417,7 +5422,7 @@
                     <w:noProof/>
                     <w:sz w:val="24"/>
                     <w:szCs w:val="24"/>
-                    <w:lang w:eastAsia="en-GB"/>
+                    <w:lang w:eastAsia="en-AU"/>
                   </w:rPr>
                   <w:tab/>
                 </w:r>
@@ -5447,7 +5452,7 @@
                     <w:noProof/>
                     <w:webHidden/>
                   </w:rPr>
-                  <w:instrText xml:space="preserve"> PAGEREF _Toc232003202 \h </w:instrText>
+                  <w:instrText xml:space="preserve"> PAGEREF _Toc232163498 \h </w:instrText>
                 </w:r>
                 <w:r>
                   <w:rPr>
@@ -5490,13 +5495,14 @@
                   <w:noProof/>
                   <w:sz w:val="24"/>
                   <w:szCs w:val="24"/>
-                  <w:lang w:eastAsia="en-GB"/>
+                  <w:lang w:eastAsia="en-AU"/>
                 </w:rPr>
               </w:pPr>
-              <w:hyperlink w:anchor="_Toc232003203" w:history="1">
+              <w:hyperlink w:anchor="_Toc232163499" w:history="1">
                 <w:r>
                   <w:rPr>
                     <w:rStyle w:val="Hyperlink"/>
+                    <w:rFonts w:ascii="Arial" w:hAnsi="Arial" w:cs="Arial"/>
                     <w:noProof/>
                   </w:rPr>
                   <w:t>12</w:t>
@@ -5507,7 +5513,7 @@
                     <w:noProof/>
                     <w:sz w:val="24"/>
                     <w:szCs w:val="24"/>
-                    <w:lang w:eastAsia="en-GB"/>
+                    <w:lang w:eastAsia="en-AU"/>
                   </w:rPr>
                   <w:tab/>
                 </w:r>
@@ -5537,7 +5543,7 @@
                     <w:noProof/>
                     <w:webHidden/>
                   </w:rPr>
-                  <w:instrText xml:space="preserve"> PAGEREF _Toc232003203 \h </w:instrText>
+                  <w:instrText xml:space="preserve"> PAGEREF _Toc232163499 \h </w:instrText>
                 </w:r>
                 <w:r>
                   <w:rPr>
@@ -5580,10 +5586,10 @@
                   <w:noProof/>
                   <w:sz w:val="24"/>
                   <w:szCs w:val="24"/>
-                  <w:lang w:eastAsia="en-GB"/>
+                  <w:lang w:eastAsia="en-AU"/>
                 </w:rPr>
               </w:pPr>
-              <w:hyperlink w:anchor="_Toc232003204" w:history="1">
+              <w:hyperlink w:anchor="_Toc232163500" w:history="1">
                 <w:r>
                   <w:rPr>
                     <w:rStyle w:val="Hyperlink"/>
@@ -5598,7 +5604,7 @@
                     <w:noProof/>
                     <w:sz w:val="24"/>
                     <w:szCs w:val="24"/>
-                    <w:lang w:eastAsia="en-GB"/>
+                    <w:lang w:eastAsia="en-AU"/>
                   </w:rPr>
                   <w:tab/>
                 </w:r>
@@ -5608,7 +5614,7 @@
                     <w:rFonts w:ascii="Arial" w:hAnsi="Arial" w:cs="Arial"/>
                     <w:noProof/>
                   </w:rPr>
-                  <w:t>Appendix A – Deliverable Task Breakdown Statement</w:t>
+                  <w:t>Appendix A — NMEA Input Format</w:t>
                 </w:r>
                 <w:r>
                   <w:rPr>
@@ -5629,7 +5635,7 @@
                     <w:noProof/>
                     <w:webHidden/>
                   </w:rPr>
-                  <w:instrText xml:space="preserve"> PAGEREF _Toc232003204 \h </w:instrText>
+                  <w:instrText xml:space="preserve"> PAGEREF _Toc232163500 \h </w:instrText>
                 </w:r>
                 <w:r>
                   <w:rPr>
@@ -5672,10 +5678,10 @@
                   <w:noProof/>
                   <w:sz w:val="24"/>
                   <w:szCs w:val="24"/>
-                  <w:lang w:eastAsia="en-GB"/>
+                  <w:lang w:eastAsia="en-AU"/>
                 </w:rPr>
               </w:pPr>
-              <w:hyperlink w:anchor="_Toc232003205" w:history="1">
+              <w:hyperlink w:anchor="_Toc232163501" w:history="1">
                 <w:r>
                   <w:rPr>
                     <w:rStyle w:val="Hyperlink"/>
@@ -5690,7 +5696,7 @@
                     <w:noProof/>
                     <w:sz w:val="24"/>
                     <w:szCs w:val="24"/>
-                    <w:lang w:eastAsia="en-GB"/>
+                    <w:lang w:eastAsia="en-AU"/>
                   </w:rPr>
                   <w:tab/>
                 </w:r>
@@ -5700,7 +5706,7 @@
                     <w:rFonts w:ascii="Arial" w:hAnsi="Arial" w:cs="Arial"/>
                     <w:noProof/>
                   </w:rPr>
-                  <w:t>Appendix B — NMEA Input Format</w:t>
+                  <w:t>Appendix B — CSV Output Format</w:t>
                 </w:r>
                 <w:r>
                   <w:rPr>
@@ -5721,7 +5727,7 @@
                     <w:noProof/>
                     <w:webHidden/>
                   </w:rPr>
-                  <w:instrText xml:space="preserve"> PAGEREF _Toc232003205 \h </w:instrText>
+                  <w:instrText xml:space="preserve"> PAGEREF _Toc232163501 \h </w:instrText>
                 </w:r>
                 <w:r>
                   <w:rPr>
@@ -5741,99 +5747,7 @@
                     <w:noProof/>
                     <w:webHidden/>
                   </w:rPr>
-                  <w:t>40</w:t>
-                </w:r>
-                <w:r>
-                  <w:rPr>
-                    <w:noProof/>
-                    <w:webHidden/>
-                  </w:rPr>
-                  <w:fldChar w:fldCharType="end"/>
-                </w:r>
-              </w:hyperlink>
-            </w:p>
-            <w:p>
-              <w:pPr>
-                <w:pStyle w:val="TOC2"/>
-                <w:tabs>
-                  <w:tab w:val="left" w:pos="960"/>
-                  <w:tab w:val="right" w:leader="dot" w:pos="9016"/>
-                </w:tabs>
-                <w:rPr>
-                  <w:rFonts w:eastAsiaTheme="minorEastAsia"/>
-                  <w:noProof/>
-                  <w:sz w:val="24"/>
-                  <w:szCs w:val="24"/>
-                  <w:lang w:eastAsia="en-GB"/>
-                </w:rPr>
-              </w:pPr>
-              <w:hyperlink w:anchor="_Toc232003206" w:history="1">
-                <w:r>
-                  <w:rPr>
-                    <w:rStyle w:val="Hyperlink"/>
-                    <w:rFonts w:ascii="Arial" w:hAnsi="Arial" w:cs="Arial"/>
-                    <w:noProof/>
-                  </w:rPr>
-                  <w:t>12.3</w:t>
-                </w:r>
-                <w:r>
-                  <w:rPr>
-                    <w:rFonts w:eastAsiaTheme="minorEastAsia"/>
-                    <w:noProof/>
-                    <w:sz w:val="24"/>
-                    <w:szCs w:val="24"/>
-                    <w:lang w:eastAsia="en-GB"/>
-                  </w:rPr>
-                  <w:tab/>
-                </w:r>
-                <w:r>
-                  <w:rPr>
-                    <w:rStyle w:val="Hyperlink"/>
-                    <w:rFonts w:ascii="Arial" w:hAnsi="Arial" w:cs="Arial"/>
-                    <w:noProof/>
-                  </w:rPr>
-                  <w:t>Appendix C — CSV Output Format</w:t>
-                </w:r>
-                <w:r>
-                  <w:rPr>
-                    <w:noProof/>
-                    <w:webHidden/>
-                  </w:rPr>
-                  <w:tab/>
-                </w:r>
-                <w:r>
-                  <w:rPr>
-                    <w:noProof/>
-                    <w:webHidden/>
-                  </w:rPr>
-                  <w:fldChar w:fldCharType="begin"/>
-                </w:r>
-                <w:r>
-                  <w:rPr>
-                    <w:noProof/>
-                    <w:webHidden/>
-                  </w:rPr>
-                  <w:instrText xml:space="preserve"> PAGEREF _Toc232003206 \h </w:instrText>
-                </w:r>
-                <w:r>
-                  <w:rPr>
-                    <w:noProof/>
-                    <w:webHidden/>
-                  </w:rPr>
-                </w:r>
-                <w:r>
-                  <w:rPr>
-                    <w:noProof/>
-                    <w:webHidden/>
-                  </w:rPr>
-                  <w:fldChar w:fldCharType="separate"/>
-                </w:r>
-                <w:r>
-                  <w:rPr>
-                    <w:noProof/>
-                    <w:webHidden/>
-                  </w:rPr>
-                  <w:t>41</w:t>
+                  <w:t>38</w:t>
                 </w:r>
                 <w:r>
                   <w:rPr>
@@ -5956,7 +5870,7 @@
         <w:pStyle w:val="Heading1"/>
         <w:jc w:val="both"/>
       </w:pPr>
-      <w:bookmarkStart w:id="0" w:name="_Toc232003157"/>
+      <w:bookmarkStart w:id="0" w:name="_Toc232163453"/>
       <w:r>
         <w:lastRenderedPageBreak/>
         <w:t>Introduction</w:t>
@@ -6010,7 +5924,7 @@
       <w:pPr>
         <w:pStyle w:val="Heading1"/>
       </w:pPr>
-      <w:bookmarkStart w:id="1" w:name="_Toc232003158"/>
+      <w:bookmarkStart w:id="1" w:name="_Toc232163454"/>
       <w:r>
         <w:rPr>
           <w:rFonts w:ascii="Arial" w:hAnsi="Arial" w:cs="Arial"/>
@@ -6149,7 +6063,7 @@
           <w:rFonts w:asciiTheme="minorHAnsi" w:hAnsiTheme="minorHAnsi" w:cstheme="minorBidi"/>
         </w:rPr>
       </w:pPr>
-      <w:bookmarkStart w:id="2" w:name="_Toc232003159"/>
+      <w:bookmarkStart w:id="2" w:name="_Toc232163455"/>
       <w:r>
         <w:t>Key Features</w:t>
       </w:r>
@@ -6182,7 +6096,31 @@
           <w:lang w:eastAsia="en-AU"/>
           <w14:ligatures w14:val="none"/>
         </w:rPr>
-        <w:t xml:space="preserve">RTK GNSS positioning using the u-blox ZED-F9P </w:t>
+        <w:t>RTK GNSS positioning using the u-</w:t>
+      </w:r>
+      <w:proofErr w:type="spellStart"/>
+      <w:r>
+        <w:rPr>
+          <w:rFonts w:ascii="Arial" w:eastAsia="Times New Roman" w:hAnsi="Arial" w:cs="Arial"/>
+          <w:kern w:val="0"/>
+          <w:sz w:val="24"/>
+          <w:szCs w:val="24"/>
+          <w:lang w:eastAsia="en-AU"/>
+          <w14:ligatures w14:val="none"/>
+        </w:rPr>
+        <w:t>blox</w:t>
+      </w:r>
+      <w:proofErr w:type="spellEnd"/>
+      <w:r>
+        <w:rPr>
+          <w:rFonts w:ascii="Arial" w:eastAsia="Times New Roman" w:hAnsi="Arial" w:cs="Arial"/>
+          <w:kern w:val="0"/>
+          <w:sz w:val="24"/>
+          <w:szCs w:val="24"/>
+          <w:lang w:eastAsia="en-AU"/>
+          <w14:ligatures w14:val="none"/>
+        </w:rPr>
+        <w:t xml:space="preserve"> ZED-F9P </w:t>
       </w:r>
     </w:p>
     <w:p>
@@ -6364,7 +6302,7 @@
       <w:pPr>
         <w:pStyle w:val="Heading1"/>
       </w:pPr>
-      <w:bookmarkStart w:id="3" w:name="_Toc232003160"/>
+      <w:bookmarkStart w:id="3" w:name="_Toc232163456"/>
       <w:r>
         <w:t>Technical Specifications</w:t>
       </w:r>
@@ -6374,7 +6312,7 @@
       <w:pPr>
         <w:pStyle w:val="Heading2"/>
       </w:pPr>
-      <w:bookmarkStart w:id="4" w:name="_Toc232003161"/>
+      <w:bookmarkStart w:id="4" w:name="_Toc232163457"/>
       <w:r>
         <w:t>In the Box</w:t>
       </w:r>
@@ -6523,7 +6461,7 @@
       <w:pPr>
         <w:pStyle w:val="Heading2"/>
       </w:pPr>
-      <w:bookmarkStart w:id="5" w:name="_Toc232003162"/>
+      <w:bookmarkStart w:id="5" w:name="_Toc232163458"/>
       <w:r>
         <w:t>Base Station</w:t>
       </w:r>
@@ -6745,13 +6683,23 @@
         </w:rPr>
         <w:t xml:space="preserve">1x </w:t>
       </w:r>
-      <w:r>
-        <w:rPr>
-          <w:rFonts w:ascii="Arial" w:hAnsi="Arial" w:cs="Arial"/>
-          <w:sz w:val="24"/>
-          <w:szCs w:val="24"/>
-        </w:rPr>
-        <w:t>SparkFun GPS-RTK-RMA-SMA</w:t>
+      <w:proofErr w:type="spellStart"/>
+      <w:r>
+        <w:rPr>
+          <w:rFonts w:ascii="Arial" w:hAnsi="Arial" w:cs="Arial"/>
+          <w:sz w:val="24"/>
+          <w:szCs w:val="24"/>
+        </w:rPr>
+        <w:t>SparkFun</w:t>
+      </w:r>
+      <w:proofErr w:type="spellEnd"/>
+      <w:r>
+        <w:rPr>
+          <w:rFonts w:ascii="Arial" w:hAnsi="Arial" w:cs="Arial"/>
+          <w:sz w:val="24"/>
+          <w:szCs w:val="24"/>
+        </w:rPr>
+        <w:t xml:space="preserve"> GPS-RTK-RMA-SMA</w:t>
       </w:r>
     </w:p>
     <w:p>
@@ -6838,7 +6786,7 @@
       <w:pPr>
         <w:pStyle w:val="Heading2"/>
       </w:pPr>
-      <w:bookmarkStart w:id="6" w:name="_Toc232003163"/>
+      <w:bookmarkStart w:id="6" w:name="_Toc232163459"/>
       <w:r>
         <w:t>Rover</w:t>
       </w:r>
@@ -7027,13 +6975,23 @@
         </w:rPr>
         <w:t xml:space="preserve">1x </w:t>
       </w:r>
-      <w:r>
-        <w:rPr>
-          <w:rFonts w:ascii="Arial" w:hAnsi="Arial" w:cs="Arial"/>
-          <w:sz w:val="24"/>
-          <w:szCs w:val="24"/>
-        </w:rPr>
-        <w:t>SparkFun GPS-RTK-RMA-SMA</w:t>
+      <w:proofErr w:type="spellStart"/>
+      <w:r>
+        <w:rPr>
+          <w:rFonts w:ascii="Arial" w:hAnsi="Arial" w:cs="Arial"/>
+          <w:sz w:val="24"/>
+          <w:szCs w:val="24"/>
+        </w:rPr>
+        <w:t>SparkFun</w:t>
+      </w:r>
+      <w:proofErr w:type="spellEnd"/>
+      <w:r>
+        <w:rPr>
+          <w:rFonts w:ascii="Arial" w:hAnsi="Arial" w:cs="Arial"/>
+          <w:sz w:val="24"/>
+          <w:szCs w:val="24"/>
+        </w:rPr>
+        <w:t xml:space="preserve"> GPS-RTK-RMA-SMA</w:t>
       </w:r>
     </w:p>
     <w:p>
@@ -7124,7 +7082,7 @@
           <w:rFonts w:ascii="Arial" w:hAnsi="Arial" w:cs="Arial"/>
         </w:rPr>
       </w:pPr>
-      <w:bookmarkStart w:id="7" w:name="_Toc232003164"/>
+      <w:bookmarkStart w:id="7" w:name="_Toc232163460"/>
       <w:r>
         <w:rPr>
           <w:rFonts w:ascii="Arial" w:hAnsi="Arial" w:cs="Arial"/>
@@ -7137,7 +7095,7 @@
       <w:pPr>
         <w:pStyle w:val="Heading2"/>
       </w:pPr>
-      <w:bookmarkStart w:id="8" w:name="_Toc232003165"/>
+      <w:bookmarkStart w:id="8" w:name="_Toc232163461"/>
       <w:r>
         <w:t xml:space="preserve">Minimum PC/Host </w:t>
       </w:r>
@@ -7168,6 +7126,7 @@
           <w:szCs w:val="24"/>
         </w:rPr>
       </w:pPr>
+      <w:proofErr w:type="spellStart"/>
       <w:r>
         <w:rPr>
           <w:rFonts w:ascii="Arial" w:hAnsi="Arial" w:cs="Arial"/>
@@ -7175,7 +7134,17 @@
           <w:sz w:val="24"/>
           <w:szCs w:val="24"/>
         </w:rPr>
-        <w:t>RTKBase Configuration</w:t>
+        <w:t>RTKBase</w:t>
+      </w:r>
+      <w:proofErr w:type="spellEnd"/>
+      <w:r>
+        <w:rPr>
+          <w:rFonts w:ascii="Arial" w:hAnsi="Arial" w:cs="Arial"/>
+          <w:b/>
+          <w:sz w:val="24"/>
+          <w:szCs w:val="24"/>
+        </w:rPr>
+        <w:t xml:space="preserve"> Configuration</w:t>
       </w:r>
       <w:r>
         <w:rPr>
@@ -7207,7 +7176,25 @@
           <w:sz w:val="24"/>
           <w:szCs w:val="24"/>
         </w:rPr>
-        <w:t>is required to launch the RTKBase software and configure the base Station’s known location.</w:t>
+        <w:t xml:space="preserve">is required to launch the </w:t>
+      </w:r>
+      <w:proofErr w:type="spellStart"/>
+      <w:r>
+        <w:rPr>
+          <w:rFonts w:ascii="Arial" w:hAnsi="Arial" w:cs="Arial"/>
+          <w:sz w:val="24"/>
+          <w:szCs w:val="24"/>
+        </w:rPr>
+        <w:t>RTKBase</w:t>
+      </w:r>
+      <w:proofErr w:type="spellEnd"/>
+      <w:r>
+        <w:rPr>
+          <w:rFonts w:ascii="Arial" w:hAnsi="Arial" w:cs="Arial"/>
+          <w:sz w:val="24"/>
+          <w:szCs w:val="24"/>
+        </w:rPr>
+        <w:t xml:space="preserve"> software and configure the base Station’s known location.</w:t>
       </w:r>
       <w:r>
         <w:rPr>
@@ -7345,7 +7332,7 @@
       <w:pPr>
         <w:pStyle w:val="Heading2"/>
       </w:pPr>
-      <w:bookmarkStart w:id="9" w:name="_Toc232003166"/>
+      <w:bookmarkStart w:id="9" w:name="_Toc232163462"/>
       <w:r>
         <w:t>Wireless Access Point</w:t>
       </w:r>
@@ -7565,7 +7552,7 @@
       <w:pPr>
         <w:pStyle w:val="Heading2"/>
       </w:pPr>
-      <w:bookmarkStart w:id="10" w:name="_Toc232003167"/>
+      <w:bookmarkStart w:id="10" w:name="_Toc232163463"/>
       <w:r>
         <w:t xml:space="preserve">Supported </w:t>
       </w:r>
@@ -7745,7 +7732,6 @@
         </w:rPr>
         <w:t xml:space="preserve"> </w:t>
       </w:r>
-      <w:commentRangeStart w:id="11"/>
       <w:r>
         <w:rPr>
           <w:rFonts w:ascii="Arial" w:hAnsi="Arial" w:cs="Arial"/>
@@ -7778,37 +7764,27 @@
         </w:rPr>
         <w:t>.</w:t>
       </w:r>
-      <w:commentRangeEnd w:id="11"/>
-      <w:r>
-        <w:rPr>
-          <w:rStyle w:val="CommentReference"/>
-          <w:rFonts w:ascii="Arial" w:hAnsi="Arial" w:cs="Arial"/>
-          <w:sz w:val="24"/>
-          <w:szCs w:val="24"/>
-        </w:rPr>
-        <w:commentReference w:id="11"/>
-      </w:r>
     </w:p>
     <w:p>
       <w:pPr>
         <w:pStyle w:val="Heading1"/>
       </w:pPr>
-      <w:bookmarkStart w:id="12" w:name="_Toc232003168"/>
+      <w:bookmarkStart w:id="11" w:name="_Toc232163464"/>
       <w:r>
         <w:lastRenderedPageBreak/>
         <w:t>Using the device</w:t>
       </w:r>
+      <w:bookmarkEnd w:id="11"/>
+    </w:p>
+    <w:p>
+      <w:pPr>
+        <w:pStyle w:val="Heading2"/>
+      </w:pPr>
+      <w:bookmarkStart w:id="12" w:name="_Toc232163465"/>
+      <w:r>
+        <w:t>Hardware installation</w:t>
+      </w:r>
       <w:bookmarkEnd w:id="12"/>
-    </w:p>
-    <w:p>
-      <w:pPr>
-        <w:pStyle w:val="Heading2"/>
-      </w:pPr>
-      <w:bookmarkStart w:id="13" w:name="_Toc232003169"/>
-      <w:r>
-        <w:t>Hardware installation</w:t>
-      </w:r>
-      <w:bookmarkEnd w:id="13"/>
       <w:r>
         <w:t xml:space="preserve"> </w:t>
       </w:r>
@@ -7918,7 +7894,25 @@
           <w:sz w:val="24"/>
           <w:szCs w:val="24"/>
         </w:rPr>
-        <w:t xml:space="preserve">The base station runs RTKBase which allows the user to monitor </w:t>
+        <w:t xml:space="preserve">The base station runs </w:t>
+      </w:r>
+      <w:proofErr w:type="spellStart"/>
+      <w:r>
+        <w:rPr>
+          <w:rFonts w:ascii="Arial" w:hAnsi="Arial" w:cs="Arial"/>
+          <w:sz w:val="24"/>
+          <w:szCs w:val="24"/>
+        </w:rPr>
+        <w:t>RTKBase</w:t>
+      </w:r>
+      <w:proofErr w:type="spellEnd"/>
+      <w:r>
+        <w:rPr>
+          <w:rFonts w:ascii="Arial" w:hAnsi="Arial" w:cs="Arial"/>
+          <w:sz w:val="24"/>
+          <w:szCs w:val="24"/>
+        </w:rPr>
+        <w:t xml:space="preserve"> which allows the user to monitor </w:t>
       </w:r>
       <w:r>
         <w:rPr>
@@ -8074,8 +8068,18 @@
           <w:sz w:val="24"/>
           <w:szCs w:val="24"/>
         </w:rPr>
-        <w:t>Dog projec</w:t>
-      </w:r>
+        <w:t xml:space="preserve">Dog </w:t>
+      </w:r>
+      <w:proofErr w:type="spellStart"/>
+      <w:r>
+        <w:rPr>
+          <w:rFonts w:ascii="Arial" w:hAnsi="Arial" w:cs="Arial"/>
+          <w:sz w:val="24"/>
+          <w:szCs w:val="24"/>
+        </w:rPr>
+        <w:t>projec</w:t>
+      </w:r>
+      <w:proofErr w:type="spellEnd"/>
     </w:p>
     <w:p>
       <w:pPr>
@@ -8129,7 +8133,7 @@
           <w:szCs w:val="24"/>
         </w:rPr>
       </w:pPr>
-      <w:hyperlink r:id="rId14" w:history="1">
+      <w:hyperlink r:id="rId10" w:history="1">
         <w:r>
           <w:rPr>
             <w:rStyle w:val="Hyperlink"/>
@@ -8153,7 +8157,7 @@
       <w:pPr>
         <w:pStyle w:val="Heading2"/>
       </w:pPr>
-      <w:bookmarkStart w:id="14" w:name="_Toc232003170"/>
+      <w:bookmarkStart w:id="13" w:name="_Toc232163466"/>
       <w:r>
         <w:t>Getting started</w:t>
       </w:r>
@@ -8163,17 +8167,17 @@
       <w:r>
         <w:t>User Interface Guide</w:t>
       </w:r>
+      <w:bookmarkEnd w:id="13"/>
+    </w:p>
+    <w:p>
+      <w:pPr>
+        <w:pStyle w:val="Heading3"/>
+      </w:pPr>
+      <w:bookmarkStart w:id="14" w:name="_Toc232163467"/>
+      <w:r>
+        <w:t>Map mode</w:t>
+      </w:r>
       <w:bookmarkEnd w:id="14"/>
-    </w:p>
-    <w:p>
-      <w:pPr>
-        <w:pStyle w:val="Heading3"/>
-      </w:pPr>
-      <w:bookmarkStart w:id="15" w:name="_Toc232003171"/>
-      <w:r>
-        <w:t>Map mode</w:t>
-      </w:r>
-      <w:bookmarkEnd w:id="15"/>
     </w:p>
     <w:p>
       <w:pPr>
@@ -8353,14 +8357,14 @@
       <w:pPr>
         <w:pStyle w:val="Heading3"/>
       </w:pPr>
-      <w:bookmarkStart w:id="16" w:name="_Toc232003172"/>
+      <w:bookmarkStart w:id="15" w:name="_Toc232163468"/>
       <w:r>
         <w:t>Find</w:t>
       </w:r>
       <w:r>
         <w:t xml:space="preserve"> mode</w:t>
       </w:r>
-      <w:bookmarkEnd w:id="16"/>
+      <w:bookmarkEnd w:id="15"/>
     </w:p>
     <w:p>
       <w:pPr>
@@ -8540,11 +8544,11 @@
       <w:pPr>
         <w:pStyle w:val="Heading3"/>
       </w:pPr>
-      <w:bookmarkStart w:id="17" w:name="_Toc232003173"/>
+      <w:bookmarkStart w:id="16" w:name="_Toc232163469"/>
       <w:r>
         <w:t>CSV Output</w:t>
       </w:r>
-      <w:bookmarkEnd w:id="17"/>
+      <w:bookmarkEnd w:id="16"/>
       <w:r>
         <w:t xml:space="preserve"> </w:t>
       </w:r>
@@ -8672,11 +8676,11 @@
       <w:pPr>
         <w:pStyle w:val="Heading3"/>
       </w:pPr>
-      <w:bookmarkStart w:id="18" w:name="_Toc232003174"/>
+      <w:bookmarkStart w:id="17" w:name="_Toc232163470"/>
       <w:r>
         <w:t>RTK Status</w:t>
       </w:r>
-      <w:bookmarkEnd w:id="18"/>
+      <w:bookmarkEnd w:id="17"/>
     </w:p>
     <w:p>
       <w:pPr>
@@ -8932,14 +8936,14 @@
       <w:pPr>
         <w:pStyle w:val="Heading3"/>
       </w:pPr>
-      <w:bookmarkStart w:id="19" w:name="_Toc232003175"/>
+      <w:bookmarkStart w:id="18" w:name="_Toc232163471"/>
       <w:r>
         <w:t>Non-Core features</w:t>
       </w:r>
       <w:r>
         <w:t xml:space="preserve"> and Customization</w:t>
       </w:r>
-      <w:bookmarkEnd w:id="19"/>
+      <w:bookmarkEnd w:id="18"/>
     </w:p>
     <w:p>
       <w:pPr>
@@ -8999,7 +9003,25 @@
           <w:sz w:val="24"/>
           <w:szCs w:val="24"/>
         </w:rPr>
-        <w:t>Includes a toggle to enable Dark Mode acroos the application</w:t>
+        <w:t xml:space="preserve">Includes a toggle to enable Dark Mode </w:t>
+      </w:r>
+      <w:proofErr w:type="spellStart"/>
+      <w:r>
+        <w:rPr>
+          <w:rFonts w:ascii="Arial" w:hAnsi="Arial" w:cs="Arial"/>
+          <w:sz w:val="24"/>
+          <w:szCs w:val="24"/>
+        </w:rPr>
+        <w:t>acroos</w:t>
+      </w:r>
+      <w:proofErr w:type="spellEnd"/>
+      <w:r>
+        <w:rPr>
+          <w:rFonts w:ascii="Arial" w:hAnsi="Arial" w:cs="Arial"/>
+          <w:sz w:val="24"/>
+          <w:szCs w:val="24"/>
+        </w:rPr>
+        <w:t xml:space="preserve"> the application</w:t>
       </w:r>
     </w:p>
     <w:p>
@@ -9030,7 +9052,25 @@
           <w:sz w:val="24"/>
           <w:szCs w:val="24"/>
         </w:rPr>
-        <w:t xml:space="preserve"> Data Toogles: Users can customize their screen by choosing to show or hide specific data fields, including:</w:t>
+        <w:t xml:space="preserve"> Data </w:t>
+      </w:r>
+      <w:proofErr w:type="spellStart"/>
+      <w:r>
+        <w:rPr>
+          <w:rFonts w:ascii="Arial" w:hAnsi="Arial" w:cs="Arial"/>
+          <w:sz w:val="24"/>
+          <w:szCs w:val="24"/>
+        </w:rPr>
+        <w:t>Toogles</w:t>
+      </w:r>
+      <w:proofErr w:type="spellEnd"/>
+      <w:r>
+        <w:rPr>
+          <w:rFonts w:ascii="Arial" w:hAnsi="Arial" w:cs="Arial"/>
+          <w:sz w:val="24"/>
+          <w:szCs w:val="24"/>
+        </w:rPr>
+        <w:t>: Users can customize their screen by choosing to show or hide specific data fields, including:</w:t>
       </w:r>
     </w:p>
     <w:p>
@@ -9175,12 +9215,12 @@
       <w:pPr>
         <w:pStyle w:val="Heading1"/>
       </w:pPr>
-      <w:bookmarkStart w:id="20" w:name="_Toc232003176"/>
+      <w:bookmarkStart w:id="19" w:name="_Toc232163472"/>
       <w:r>
         <w:lastRenderedPageBreak/>
         <w:t>Recommended Usage</w:t>
       </w:r>
-      <w:bookmarkEnd w:id="20"/>
+      <w:bookmarkEnd w:id="19"/>
     </w:p>
     <w:p>
       <w:pPr>
@@ -9639,11 +9679,11 @@
       <w:pPr>
         <w:pStyle w:val="Heading1"/>
       </w:pPr>
-      <w:bookmarkStart w:id="21" w:name="_Toc232003177"/>
+      <w:bookmarkStart w:id="20" w:name="_Toc232163473"/>
       <w:r>
         <w:t>Hardware Setup</w:t>
       </w:r>
-      <w:bookmarkEnd w:id="21"/>
+      <w:bookmarkEnd w:id="20"/>
     </w:p>
     <w:p/>
     <w:p>
@@ -9687,11 +9727,11 @@
         <w:pStyle w:val="Heading2"/>
         <w:ind w:left="426"/>
       </w:pPr>
-      <w:bookmarkStart w:id="22" w:name="_Toc232003178"/>
+      <w:bookmarkStart w:id="21" w:name="_Toc232163474"/>
       <w:r>
         <w:t>Equipment needed</w:t>
       </w:r>
-      <w:bookmarkEnd w:id="22"/>
+      <w:bookmarkEnd w:id="21"/>
     </w:p>
     <w:p>
       <w:pPr>
@@ -10004,11 +10044,11 @@
         <w:pStyle w:val="Heading2"/>
         <w:jc w:val="both"/>
       </w:pPr>
-      <w:bookmarkStart w:id="23" w:name="_Toc232003179"/>
+      <w:bookmarkStart w:id="22" w:name="_Toc232163475"/>
       <w:r>
         <w:t>Setting up the equipment</w:t>
       </w:r>
-      <w:bookmarkEnd w:id="23"/>
+      <w:bookmarkEnd w:id="22"/>
       <w:r>
         <w:t xml:space="preserve"> </w:t>
       </w:r>
@@ -10046,11 +10086,11 @@
         <w:pStyle w:val="Heading3"/>
         <w:jc w:val="both"/>
       </w:pPr>
-      <w:bookmarkStart w:id="24" w:name="_Toc232003180"/>
+      <w:bookmarkStart w:id="23" w:name="_Toc232163476"/>
       <w:r>
         <w:t>Base Station</w:t>
       </w:r>
-      <w:bookmarkEnd w:id="24"/>
+      <w:bookmarkEnd w:id="23"/>
     </w:p>
     <w:p>
       <w:pPr>
@@ -10868,7 +10908,7 @@
           <w:szCs w:val="32"/>
         </w:rPr>
       </w:pPr>
-      <w:bookmarkStart w:id="25" w:name="_Toc232003181"/>
+      <w:bookmarkStart w:id="24" w:name="_Toc232163477"/>
       <w:r>
         <w:rPr>
           <w:sz w:val="32"/>
@@ -10876,7 +10916,7 @@
         </w:rPr>
         <w:t>Mobile Rover</w:t>
       </w:r>
-      <w:bookmarkEnd w:id="25"/>
+      <w:bookmarkEnd w:id="24"/>
       <w:r>
         <w:rPr>
           <w:sz w:val="32"/>
@@ -11672,26 +11712,26 @@
       <w:pPr>
         <w:pStyle w:val="Heading1"/>
       </w:pPr>
-      <w:bookmarkStart w:id="26" w:name="_Toc232003182"/>
+      <w:bookmarkStart w:id="25" w:name="_Toc232163478"/>
       <w:r>
         <w:lastRenderedPageBreak/>
         <w:t>Software Setup</w:t>
       </w:r>
+      <w:bookmarkEnd w:id="25"/>
+      <w:r>
+        <w:t xml:space="preserve"> </w:t>
+      </w:r>
+    </w:p>
+    <w:p>
+      <w:pPr>
+        <w:pStyle w:val="Heading2"/>
+        <w:spacing w:line="480" w:lineRule="auto"/>
+      </w:pPr>
+      <w:bookmarkStart w:id="26" w:name="_Toc232163479"/>
+      <w:r>
+        <w:t>Base Station Initial Setup</w:t>
+      </w:r>
       <w:bookmarkEnd w:id="26"/>
-      <w:r>
-        <w:t xml:space="preserve"> </w:t>
-      </w:r>
-    </w:p>
-    <w:p>
-      <w:pPr>
-        <w:pStyle w:val="Heading2"/>
-        <w:spacing w:line="480" w:lineRule="auto"/>
-      </w:pPr>
-      <w:bookmarkStart w:id="27" w:name="_Toc232003183"/>
-      <w:r>
-        <w:t>Base Station Initial Setup</w:t>
-      </w:r>
-      <w:bookmarkEnd w:id="27"/>
       <w:r>
         <w:t xml:space="preserve"> </w:t>
       </w:r>
@@ -11826,11 +11866,11 @@
         <w:spacing w:line="480" w:lineRule="auto"/>
         <w:jc w:val="both"/>
       </w:pPr>
-      <w:bookmarkStart w:id="28" w:name="_Toc232003184"/>
+      <w:bookmarkStart w:id="27" w:name="_Toc232163480"/>
       <w:r>
         <w:t>Device Configuration</w:t>
       </w:r>
-      <w:bookmarkEnd w:id="28"/>
+      <w:bookmarkEnd w:id="27"/>
     </w:p>
     <w:p>
       <w:pPr>
@@ -12470,15 +12510,33 @@
           <w:sz w:val="24"/>
           <w:szCs w:val="24"/>
         </w:rPr>
-        <w:t xml:space="preserve"> RTK</w:t>
-      </w:r>
-      <w:r>
-        <w:rPr>
-          <w:rFonts w:ascii="Arial" w:hAnsi="Arial" w:cs="Arial"/>
-          <w:sz w:val="24"/>
-          <w:szCs w:val="24"/>
-        </w:rPr>
-        <w:t>Base login page</w:t>
+        <w:t xml:space="preserve"> </w:t>
+      </w:r>
+      <w:proofErr w:type="spellStart"/>
+      <w:r>
+        <w:rPr>
+          <w:rFonts w:ascii="Arial" w:hAnsi="Arial" w:cs="Arial"/>
+          <w:sz w:val="24"/>
+          <w:szCs w:val="24"/>
+        </w:rPr>
+        <w:t>RTK</w:t>
+      </w:r>
+      <w:r>
+        <w:rPr>
+          <w:rFonts w:ascii="Arial" w:hAnsi="Arial" w:cs="Arial"/>
+          <w:sz w:val="24"/>
+          <w:szCs w:val="24"/>
+        </w:rPr>
+        <w:t>Base</w:t>
+      </w:r>
+      <w:proofErr w:type="spellEnd"/>
+      <w:r>
+        <w:rPr>
+          <w:rFonts w:ascii="Arial" w:hAnsi="Arial" w:cs="Arial"/>
+          <w:sz w:val="24"/>
+          <w:szCs w:val="24"/>
+        </w:rPr>
+        <w:t xml:space="preserve"> login page</w:t>
       </w:r>
       <w:r>
         <w:rPr>
@@ -12581,7 +12639,7 @@
         </w:rPr>
         <w:lastRenderedPageBreak/>
         <w:drawing>
-          <wp:anchor distT="0" distB="0" distL="114300" distR="114300" simplePos="0" relativeHeight="251658247" behindDoc="1" locked="0" layoutInCell="1" allowOverlap="1" wp14:anchorId="554BCB80" wp14:editId="0D0B2A22">
+          <wp:anchor distT="0" distB="0" distL="114300" distR="114300" simplePos="0" relativeHeight="251658247" behindDoc="1" locked="0" layoutInCell="1" allowOverlap="1" wp14:anchorId="554BCB80" wp14:editId="05D0EC54">
             <wp:simplePos x="0" y="0"/>
             <wp:positionH relativeFrom="column">
               <wp:posOffset>533206</wp:posOffset>
@@ -12612,7 +12670,7 @@
                     <pic:cNvPicPr/>
                   </pic:nvPicPr>
                   <pic:blipFill>
-                    <a:blip r:embed="rId15" cstate="print">
+                    <a:blip r:embed="rId11" cstate="print">
                       <a:extLst>
                         <a:ext uri="{28A0092B-C50C-407E-A947-70E740481C1C}">
                           <a14:useLocalDpi xmlns:a14="http://schemas.microsoft.com/office/drawing/2010/main" val="0"/>
@@ -12652,7 +12710,7 @@
           <w:szCs w:val="24"/>
         </w:rPr>
         <w:drawing>
-          <wp:anchor distT="0" distB="0" distL="114300" distR="114300" simplePos="0" relativeHeight="251658246" behindDoc="1" locked="0" layoutInCell="1" allowOverlap="1" wp14:anchorId="0D8A0589" wp14:editId="3983B6DE">
+          <wp:anchor distT="0" distB="0" distL="114300" distR="114300" simplePos="0" relativeHeight="251658246" behindDoc="1" locked="0" layoutInCell="1" allowOverlap="1" wp14:anchorId="0D8A0589" wp14:editId="12F616AF">
             <wp:simplePos x="0" y="0"/>
             <wp:positionH relativeFrom="column">
               <wp:posOffset>501650</wp:posOffset>
@@ -12683,7 +12741,7 @@
                     <pic:cNvPicPr/>
                   </pic:nvPicPr>
                   <pic:blipFill>
-                    <a:blip r:embed="rId16" cstate="print">
+                    <a:blip r:embed="rId12" cstate="print">
                       <a:extLst>
                         <a:ext uri="{28A0092B-C50C-407E-A947-70E740481C1C}">
                           <a14:useLocalDpi xmlns:a14="http://schemas.microsoft.com/office/drawing/2010/main" val="0"/>
@@ -12821,7 +12879,25 @@
           <w:sz w:val="24"/>
           <w:szCs w:val="24"/>
         </w:rPr>
-        <w:t xml:space="preserve">system should automatically detect the u-blox ZED-F9P module and display a confirmation prompt. </w:t>
+        <w:t>system should automatically detect the u-</w:t>
+      </w:r>
+      <w:proofErr w:type="spellStart"/>
+      <w:r>
+        <w:rPr>
+          <w:rFonts w:ascii="Arial" w:hAnsi="Arial" w:cs="Arial"/>
+          <w:sz w:val="24"/>
+          <w:szCs w:val="24"/>
+        </w:rPr>
+        <w:t>blox</w:t>
+      </w:r>
+      <w:proofErr w:type="spellEnd"/>
+      <w:r>
+        <w:rPr>
+          <w:rFonts w:ascii="Arial" w:hAnsi="Arial" w:cs="Arial"/>
+          <w:sz w:val="24"/>
+          <w:szCs w:val="24"/>
+        </w:rPr>
+        <w:t xml:space="preserve"> ZED-F9P module and display a confirmation prompt. </w:t>
       </w:r>
       <w:r>
         <w:rPr>
@@ -12880,7 +12956,7 @@
           <w:szCs w:val="24"/>
         </w:rPr>
         <w:drawing>
-          <wp:anchor distT="0" distB="0" distL="114300" distR="114300" simplePos="0" relativeHeight="251658248" behindDoc="1" locked="0" layoutInCell="1" allowOverlap="1" wp14:anchorId="496CB274" wp14:editId="1E6F93BF">
+          <wp:anchor distT="0" distB="0" distL="114300" distR="114300" simplePos="0" relativeHeight="251658248" behindDoc="1" locked="0" layoutInCell="1" allowOverlap="1" wp14:anchorId="496CB274" wp14:editId="18586A63">
             <wp:simplePos x="0" y="0"/>
             <wp:positionH relativeFrom="column">
               <wp:posOffset>361315</wp:posOffset>
@@ -12911,7 +12987,7 @@
                     <pic:cNvPicPr/>
                   </pic:nvPicPr>
                   <pic:blipFill>
-                    <a:blip r:embed="rId17" cstate="print">
+                    <a:blip r:embed="rId13" cstate="print">
                       <a:extLst>
                         <a:ext uri="{28A0092B-C50C-407E-A947-70E740481C1C}">
                           <a14:useLocalDpi xmlns:a14="http://schemas.microsoft.com/office/drawing/2010/main" val="0"/>
@@ -12978,7 +13054,7 @@
           <w:szCs w:val="24"/>
         </w:rPr>
         <w:drawing>
-          <wp:anchor distT="0" distB="0" distL="114300" distR="114300" simplePos="0" relativeHeight="251658249" behindDoc="1" locked="0" layoutInCell="1" allowOverlap="1" wp14:anchorId="6340F257" wp14:editId="74F9639E">
+          <wp:anchor distT="0" distB="0" distL="114300" distR="114300" simplePos="0" relativeHeight="251658249" behindDoc="1" locked="0" layoutInCell="1" allowOverlap="1" wp14:anchorId="6340F257" wp14:editId="53B315CE">
             <wp:simplePos x="0" y="0"/>
             <wp:positionH relativeFrom="column">
               <wp:posOffset>363220</wp:posOffset>
@@ -13009,7 +13085,7 @@
                     <pic:cNvPicPr/>
                   </pic:nvPicPr>
                   <pic:blipFill>
-                    <a:blip r:embed="rId18" cstate="print">
+                    <a:blip r:embed="rId14" cstate="print">
                       <a:extLst>
                         <a:ext uri="{28A0092B-C50C-407E-A947-70E740481C1C}">
                           <a14:useLocalDpi xmlns:a14="http://schemas.microsoft.com/office/drawing/2010/main" val="0"/>
@@ -13093,7 +13169,7 @@
         </w:rPr>
         <w:lastRenderedPageBreak/>
         <w:drawing>
-          <wp:anchor distT="0" distB="0" distL="114300" distR="114300" simplePos="0" relativeHeight="251658250" behindDoc="1" locked="0" layoutInCell="1" allowOverlap="1" wp14:anchorId="459338B4" wp14:editId="4418581F">
+          <wp:anchor distT="0" distB="0" distL="114300" distR="114300" simplePos="0" relativeHeight="251658250" behindDoc="1" locked="0" layoutInCell="1" allowOverlap="1" wp14:anchorId="459338B4" wp14:editId="1C571451">
             <wp:simplePos x="0" y="0"/>
             <wp:positionH relativeFrom="column">
               <wp:posOffset>406944</wp:posOffset>
@@ -13124,7 +13200,7 @@
                     <pic:cNvPicPr/>
                   </pic:nvPicPr>
                   <pic:blipFill>
-                    <a:blip r:embed="rId19" cstate="print">
+                    <a:blip r:embed="rId15" cstate="print">
                       <a:extLst>
                         <a:ext uri="{28A0092B-C50C-407E-A947-70E740481C1C}">
                           <a14:useLocalDpi xmlns:a14="http://schemas.microsoft.com/office/drawing/2010/main" val="0"/>
@@ -13276,7 +13352,7 @@
           <w:szCs w:val="24"/>
         </w:rPr>
         <w:drawing>
-          <wp:anchor distT="0" distB="0" distL="114300" distR="114300" simplePos="0" relativeHeight="251658251" behindDoc="1" locked="0" layoutInCell="1" allowOverlap="1" wp14:anchorId="50892CBE" wp14:editId="4B8EE5F2">
+          <wp:anchor distT="0" distB="0" distL="114300" distR="114300" simplePos="0" relativeHeight="251658251" behindDoc="1" locked="0" layoutInCell="1" allowOverlap="1" wp14:anchorId="50892CBE" wp14:editId="6E6B1024">
             <wp:simplePos x="0" y="0"/>
             <wp:positionH relativeFrom="column">
               <wp:posOffset>530588</wp:posOffset>
@@ -13307,7 +13383,7 @@
                     <pic:cNvPicPr/>
                   </pic:nvPicPr>
                   <pic:blipFill>
-                    <a:blip r:embed="rId15" cstate="print">
+                    <a:blip r:embed="rId11" cstate="print">
                       <a:extLst>
                         <a:ext uri="{28A0092B-C50C-407E-A947-70E740481C1C}">
                           <a14:useLocalDpi xmlns:a14="http://schemas.microsoft.com/office/drawing/2010/main" val="0"/>
@@ -13381,15 +13457,33 @@
           <w:sz w:val="24"/>
           <w:szCs w:val="24"/>
         </w:rPr>
-        <w:t>Switch the “N</w:t>
-      </w:r>
-      <w:r>
-        <w:rPr>
-          <w:rFonts w:ascii="Arial" w:hAnsi="Arial" w:cs="Arial"/>
-          <w:sz w:val="24"/>
-          <w:szCs w:val="24"/>
-        </w:rPr>
-        <w:t xml:space="preserve">trip Caster service” toggle to </w:t>
+        <w:t>Switch the “</w:t>
+      </w:r>
+      <w:proofErr w:type="spellStart"/>
+      <w:r>
+        <w:rPr>
+          <w:rFonts w:ascii="Arial" w:hAnsi="Arial" w:cs="Arial"/>
+          <w:sz w:val="24"/>
+          <w:szCs w:val="24"/>
+        </w:rPr>
+        <w:t>N</w:t>
+      </w:r>
+      <w:r>
+        <w:rPr>
+          <w:rFonts w:ascii="Arial" w:hAnsi="Arial" w:cs="Arial"/>
+          <w:sz w:val="24"/>
+          <w:szCs w:val="24"/>
+        </w:rPr>
+        <w:t>trip</w:t>
+      </w:r>
+      <w:proofErr w:type="spellEnd"/>
+      <w:r>
+        <w:rPr>
+          <w:rFonts w:ascii="Arial" w:hAnsi="Arial" w:cs="Arial"/>
+          <w:sz w:val="24"/>
+          <w:szCs w:val="24"/>
+        </w:rPr>
+        <w:t xml:space="preserve"> Caster service” toggle to </w:t>
       </w:r>
       <w:r>
         <w:rPr>
@@ -13532,8 +13626,18 @@
           <w:sz w:val="24"/>
           <w:szCs w:val="24"/>
         </w:rPr>
-        <w:t xml:space="preserve"> basestation</w:t>
-      </w:r>
+        <w:t xml:space="preserve"> </w:t>
+      </w:r>
+      <w:proofErr w:type="spellStart"/>
+      <w:r>
+        <w:rPr>
+          <w:rFonts w:ascii="Arial" w:hAnsi="Arial" w:cs="Arial"/>
+          <w:sz w:val="24"/>
+          <w:szCs w:val="24"/>
+        </w:rPr>
+        <w:t>basestation</w:t>
+      </w:r>
+      <w:proofErr w:type="spellEnd"/>
     </w:p>
     <w:p>
       <w:pPr>
@@ -13595,7 +13699,7 @@
           <w:szCs w:val="24"/>
         </w:rPr>
         <w:drawing>
-          <wp:anchor distT="0" distB="0" distL="114300" distR="114300" simplePos="0" relativeHeight="251658252" behindDoc="1" locked="0" layoutInCell="1" allowOverlap="1" wp14:anchorId="7410B56D" wp14:editId="39FA1F48">
+          <wp:anchor distT="0" distB="0" distL="114300" distR="114300" simplePos="0" relativeHeight="251658252" behindDoc="1" locked="0" layoutInCell="1" allowOverlap="1" wp14:anchorId="7410B56D" wp14:editId="2B5EC9A9">
             <wp:simplePos x="0" y="0"/>
             <wp:positionH relativeFrom="column">
               <wp:posOffset>598351</wp:posOffset>
@@ -13626,7 +13730,7 @@
                     <pic:cNvPicPr/>
                   </pic:nvPicPr>
                   <pic:blipFill>
-                    <a:blip r:embed="rId20" cstate="print">
+                    <a:blip r:embed="rId16" cstate="print">
                       <a:extLst>
                         <a:ext uri="{28A0092B-C50C-407E-A947-70E740481C1C}">
                           <a14:useLocalDpi xmlns:a14="http://schemas.microsoft.com/office/drawing/2010/main" val="0"/>
@@ -13829,7 +13933,7 @@
         <w:pStyle w:val="Heading2"/>
         <w:spacing w:line="480" w:lineRule="auto"/>
       </w:pPr>
-      <w:bookmarkStart w:id="29" w:name="_Toc232003185"/>
+      <w:bookmarkStart w:id="28" w:name="_Toc232163481"/>
       <w:r>
         <w:lastRenderedPageBreak/>
         <w:t xml:space="preserve">Rover </w:t>
@@ -13840,7 +13944,7 @@
       <w:r>
         <w:t xml:space="preserve"> Setup</w:t>
       </w:r>
-      <w:bookmarkEnd w:id="29"/>
+      <w:bookmarkEnd w:id="28"/>
     </w:p>
     <w:p>
       <w:pPr>
@@ -13890,14 +13994,14 @@
         <w:pStyle w:val="Heading3"/>
         <w:jc w:val="both"/>
       </w:pPr>
-      <w:bookmarkStart w:id="30" w:name="_Toc232003186"/>
+      <w:bookmarkStart w:id="29" w:name="_Toc232163482"/>
       <w:r>
         <w:t>Device Configuration</w:t>
       </w:r>
       <w:r>
         <w:t xml:space="preserve"> and Manual Startup</w:t>
       </w:r>
-      <w:bookmarkEnd w:id="30"/>
+      <w:bookmarkEnd w:id="29"/>
     </w:p>
     <w:p>
       <w:pPr>
@@ -14720,15 +14824,33 @@
           <w:sz w:val="24"/>
           <w:szCs w:val="24"/>
         </w:rPr>
-        <w:t>cd  Farm</w:t>
-      </w:r>
+        <w:t xml:space="preserve">cd  </w:t>
+      </w:r>
+      <w:proofErr w:type="spellStart"/>
       <w:r>
         <w:rPr>
           <w:rFonts w:ascii="Courier New" w:eastAsia="Courier New" w:hAnsi="Courier New" w:cs="Courier New"/>
           <w:sz w:val="24"/>
           <w:szCs w:val="24"/>
         </w:rPr>
-        <w:t>Dog-App</w:t>
+        <w:t>Farm</w:t>
+      </w:r>
+      <w:r>
+        <w:rPr>
+          <w:rFonts w:ascii="Courier New" w:eastAsia="Courier New" w:hAnsi="Courier New" w:cs="Courier New"/>
+          <w:sz w:val="24"/>
+          <w:szCs w:val="24"/>
+        </w:rPr>
+        <w:t>Dog</w:t>
+      </w:r>
+      <w:proofErr w:type="spellEnd"/>
+      <w:r>
+        <w:rPr>
+          <w:rFonts w:ascii="Courier New" w:eastAsia="Courier New" w:hAnsi="Courier New" w:cs="Courier New"/>
+          <w:sz w:val="24"/>
+          <w:szCs w:val="24"/>
+        </w:rPr>
+        <w:t>-App</w:t>
       </w:r>
     </w:p>
     <w:p>
@@ -14814,7 +14936,25 @@
           <w:sz w:val="24"/>
           <w:szCs w:val="24"/>
         </w:rPr>
-        <w:t>source ~/FarmDog/bin/activate </w:t>
+        <w:t>source ~/</w:t>
+      </w:r>
+      <w:proofErr w:type="spellStart"/>
+      <w:r>
+        <w:rPr>
+          <w:rFonts w:ascii="Courier New" w:eastAsia="Courier New" w:hAnsi="Courier New" w:cs="Courier New"/>
+          <w:sz w:val="24"/>
+          <w:szCs w:val="24"/>
+        </w:rPr>
+        <w:t>FarmDog</w:t>
+      </w:r>
+      <w:proofErr w:type="spellEnd"/>
+      <w:r>
+        <w:rPr>
+          <w:rFonts w:ascii="Courier New" w:eastAsia="Courier New" w:hAnsi="Courier New" w:cs="Courier New"/>
+          <w:sz w:val="24"/>
+          <w:szCs w:val="24"/>
+        </w:rPr>
+        <w:t>/bin/activate </w:t>
       </w:r>
     </w:p>
     <w:p>
@@ -15067,7 +15207,7 @@
           <w:rFonts w:ascii="Arial" w:hAnsi="Arial" w:cs="Arial"/>
         </w:rPr>
       </w:pPr>
-      <w:bookmarkStart w:id="31" w:name="_Toc232003187"/>
+      <w:bookmarkStart w:id="30" w:name="_Toc232163483"/>
       <w:r>
         <w:rPr>
           <w:rFonts w:ascii="Arial" w:hAnsi="Arial" w:cs="Arial"/>
@@ -15075,7 +15215,7 @@
         <w:lastRenderedPageBreak/>
         <w:t>Connecting the Rover to the Base Station (NTRIP Setup)</w:t>
       </w:r>
-      <w:bookmarkEnd w:id="31"/>
+      <w:bookmarkEnd w:id="30"/>
     </w:p>
     <w:p>
       <w:pPr>
@@ -15209,7 +15349,25 @@
           <w:sz w:val="24"/>
           <w:szCs w:val="24"/>
         </w:rPr>
-        <w:t>cd  FarmDog-App</w:t>
+        <w:t xml:space="preserve">cd  </w:t>
+      </w:r>
+      <w:proofErr w:type="spellStart"/>
+      <w:r>
+        <w:rPr>
+          <w:rFonts w:ascii="Courier New" w:eastAsia="Courier New" w:hAnsi="Courier New" w:cs="Courier New"/>
+          <w:sz w:val="24"/>
+          <w:szCs w:val="24"/>
+        </w:rPr>
+        <w:t>FarmDog</w:t>
+      </w:r>
+      <w:proofErr w:type="spellEnd"/>
+      <w:r>
+        <w:rPr>
+          <w:rFonts w:ascii="Courier New" w:eastAsia="Courier New" w:hAnsi="Courier New" w:cs="Courier New"/>
+          <w:sz w:val="24"/>
+          <w:szCs w:val="24"/>
+        </w:rPr>
+        <w:t>-App</w:t>
       </w:r>
     </w:p>
     <w:p>
@@ -15223,13 +15381,23 @@
           <w:szCs w:val="24"/>
         </w:rPr>
       </w:pPr>
+      <w:proofErr w:type="spellStart"/>
       <w:r>
         <w:rPr>
           <w:rFonts w:ascii="Courier New" w:eastAsia="Courier New" w:hAnsi="Courier New" w:cs="Courier New"/>
           <w:sz w:val="24"/>
           <w:szCs w:val="24"/>
         </w:rPr>
-        <w:t>sudo nano FarmDog.py</w:t>
+        <w:t>sudo</w:t>
+      </w:r>
+      <w:proofErr w:type="spellEnd"/>
+      <w:r>
+        <w:rPr>
+          <w:rFonts w:ascii="Courier New" w:eastAsia="Courier New" w:hAnsi="Courier New" w:cs="Courier New"/>
+          <w:sz w:val="24"/>
+          <w:szCs w:val="24"/>
+        </w:rPr>
+        <w:t xml:space="preserve"> nano FarmDog.py</w:t>
       </w:r>
     </w:p>
     <w:p>
@@ -15290,13 +15458,23 @@
           <w:szCs w:val="24"/>
         </w:rPr>
       </w:pPr>
+      <w:proofErr w:type="spellStart"/>
       <w:r>
         <w:rPr>
           <w:rFonts w:ascii="Courier New" w:eastAsia="Courier New" w:hAnsi="Courier New" w:cs="Courier New"/>
           <w:sz w:val="24"/>
           <w:szCs w:val="24"/>
         </w:rPr>
-        <w:t>sudo nano FarmDog.py</w:t>
+        <w:t>sudo</w:t>
+      </w:r>
+      <w:proofErr w:type="spellEnd"/>
+      <w:r>
+        <w:rPr>
+          <w:rFonts w:ascii="Courier New" w:eastAsia="Courier New" w:hAnsi="Courier New" w:cs="Courier New"/>
+          <w:sz w:val="24"/>
+          <w:szCs w:val="24"/>
+        </w:rPr>
+        <w:t xml:space="preserve"> nano FarmDog.py</w:t>
       </w:r>
     </w:p>
     <w:p>
@@ -15315,7 +15493,25 @@
           <w:sz w:val="24"/>
           <w:szCs w:val="24"/>
         </w:rPr>
-        <w:t>Change the baseIP: str = ‘[IP BASESTATION]’</w:t>
+        <w:t xml:space="preserve">Change the </w:t>
+      </w:r>
+      <w:proofErr w:type="spellStart"/>
+      <w:r>
+        <w:rPr>
+          <w:rFonts w:ascii="Courier New" w:eastAsia="Courier New" w:hAnsi="Courier New" w:cs="Courier New"/>
+          <w:sz w:val="24"/>
+          <w:szCs w:val="24"/>
+        </w:rPr>
+        <w:t>baseIP</w:t>
+      </w:r>
+      <w:proofErr w:type="spellEnd"/>
+      <w:r>
+        <w:rPr>
+          <w:rFonts w:ascii="Courier New" w:eastAsia="Courier New" w:hAnsi="Courier New" w:cs="Courier New"/>
+          <w:sz w:val="24"/>
+          <w:szCs w:val="24"/>
+        </w:rPr>
+        <w:t>: str = ‘[IP BASESTATION]’</w:t>
       </w:r>
     </w:p>
     <w:p>
@@ -15347,13 +15543,23 @@
           <w:szCs w:val="24"/>
         </w:rPr>
       </w:pPr>
+      <w:proofErr w:type="spellStart"/>
       <w:r>
         <w:rPr>
           <w:rFonts w:ascii="Courier New" w:eastAsia="Courier New" w:hAnsi="Courier New" w:cs="Courier New"/>
           <w:sz w:val="24"/>
           <w:szCs w:val="24"/>
         </w:rPr>
-        <w:t>ntripUser: str = ‘[USER BASE STATION]’</w:t>
+        <w:t>ntripUser</w:t>
+      </w:r>
+      <w:proofErr w:type="spellEnd"/>
+      <w:r>
+        <w:rPr>
+          <w:rFonts w:ascii="Courier New" w:eastAsia="Courier New" w:hAnsi="Courier New" w:cs="Courier New"/>
+          <w:sz w:val="24"/>
+          <w:szCs w:val="24"/>
+        </w:rPr>
+        <w:t>: str = ‘[USER BASE STATION]’</w:t>
       </w:r>
     </w:p>
     <w:p>
@@ -15366,13 +15572,23 @@
           <w:szCs w:val="24"/>
         </w:rPr>
       </w:pPr>
+      <w:proofErr w:type="spellStart"/>
       <w:r>
         <w:rPr>
           <w:rFonts w:ascii="Courier New" w:eastAsia="Courier New" w:hAnsi="Courier New" w:cs="Courier New"/>
           <w:sz w:val="24"/>
           <w:szCs w:val="24"/>
         </w:rPr>
-        <w:t>ntripPass: str = ‘[USER PASSWORD BASE STATION]’</w:t>
+        <w:t>ntripPass</w:t>
+      </w:r>
+      <w:proofErr w:type="spellEnd"/>
+      <w:r>
+        <w:rPr>
+          <w:rFonts w:ascii="Courier New" w:eastAsia="Courier New" w:hAnsi="Courier New" w:cs="Courier New"/>
+          <w:sz w:val="24"/>
+          <w:szCs w:val="24"/>
+        </w:rPr>
+        <w:t>: str = ‘[USER PASSWORD BASE STATION]’</w:t>
       </w:r>
     </w:p>
     <w:p>
@@ -15453,7 +15669,7 @@
                     <pic:cNvPicPr/>
                   </pic:nvPicPr>
                   <pic:blipFill>
-                    <a:blip r:embed="rId21" cstate="print">
+                    <a:blip r:embed="rId17" cstate="print">
                       <a:extLst>
                         <a:ext uri="{28A0092B-C50C-407E-A947-70E740481C1C}">
                           <a14:useLocalDpi xmlns:a14="http://schemas.microsoft.com/office/drawing/2010/main" val="0"/>
@@ -15676,7 +15892,7 @@
           <w:szCs w:val="32"/>
         </w:rPr>
       </w:pPr>
-      <w:bookmarkStart w:id="32" w:name="_Toc232003188"/>
+      <w:bookmarkStart w:id="31" w:name="_Toc232163484"/>
       <w:r>
         <w:rPr>
           <w:sz w:val="32"/>
@@ -15705,7 +15921,7 @@
         </w:rPr>
         <w:t>Reinstallation</w:t>
       </w:r>
-      <w:bookmarkEnd w:id="32"/>
+      <w:bookmarkEnd w:id="31"/>
     </w:p>
     <w:p>
       <w:pPr>
@@ -15718,6 +15934,7 @@
           <w:szCs w:val="24"/>
         </w:rPr>
       </w:pPr>
+      <w:proofErr w:type="gramStart"/>
       <w:r>
         <w:rPr>
           <w:rFonts w:ascii="Arial" w:hAnsi="Arial" w:cs="Arial"/>
@@ -15732,7 +15949,16 @@
           <w:sz w:val="24"/>
           <w:szCs w:val="24"/>
         </w:rPr>
-        <w:t>event that scripts become</w:t>
+        <w:t>event that</w:t>
+      </w:r>
+      <w:proofErr w:type="gramEnd"/>
+      <w:r>
+        <w:rPr>
+          <w:rFonts w:ascii="Arial" w:hAnsi="Arial" w:cs="Arial"/>
+          <w:sz w:val="24"/>
+          <w:szCs w:val="24"/>
+        </w:rPr>
+        <w:t xml:space="preserve"> scripts become</w:t>
       </w:r>
       <w:r>
         <w:rPr>
@@ -16150,7 +16376,7 @@
           <w:szCs w:val="32"/>
         </w:rPr>
       </w:pPr>
-      <w:bookmarkStart w:id="33" w:name="_Toc232003189"/>
+      <w:bookmarkStart w:id="32" w:name="_Toc232163485"/>
       <w:r>
         <w:rPr>
           <w:sz w:val="32"/>
@@ -16158,7 +16384,7 @@
         </w:rPr>
         <w:t>Automatic installation script</w:t>
       </w:r>
-      <w:bookmarkEnd w:id="33"/>
+      <w:bookmarkEnd w:id="32"/>
       <w:r>
         <w:rPr>
           <w:sz w:val="32"/>
@@ -16244,15 +16470,33 @@
           <w:sz w:val="24"/>
           <w:szCs w:val="24"/>
         </w:rPr>
-        <w:t>Change directory into “Farm</w:t>
-      </w:r>
-      <w:r>
-        <w:rPr>
-          <w:rFonts w:ascii="Arial" w:hAnsi="Arial" w:cs="Arial"/>
-          <w:sz w:val="24"/>
-          <w:szCs w:val="24"/>
-        </w:rPr>
-        <w:t>Dog-App</w:t>
+        <w:t>Change directory into “</w:t>
+      </w:r>
+      <w:proofErr w:type="spellStart"/>
+      <w:r>
+        <w:rPr>
+          <w:rFonts w:ascii="Arial" w:hAnsi="Arial" w:cs="Arial"/>
+          <w:sz w:val="24"/>
+          <w:szCs w:val="24"/>
+        </w:rPr>
+        <w:t>Farm</w:t>
+      </w:r>
+      <w:r>
+        <w:rPr>
+          <w:rFonts w:ascii="Arial" w:hAnsi="Arial" w:cs="Arial"/>
+          <w:sz w:val="24"/>
+          <w:szCs w:val="24"/>
+        </w:rPr>
+        <w:t>Dog</w:t>
+      </w:r>
+      <w:proofErr w:type="spellEnd"/>
+      <w:r>
+        <w:rPr>
+          <w:rFonts w:ascii="Arial" w:hAnsi="Arial" w:cs="Arial"/>
+          <w:sz w:val="24"/>
+          <w:szCs w:val="24"/>
+        </w:rPr>
+        <w:t>-App</w:t>
       </w:r>
       <w:r>
         <w:rPr>
@@ -16280,7 +16524,25 @@
           <w:sz w:val="24"/>
           <w:szCs w:val="24"/>
         </w:rPr>
-        <w:t>cd FarmDog-App</w:t>
+        <w:t xml:space="preserve">cd </w:t>
+      </w:r>
+      <w:proofErr w:type="spellStart"/>
+      <w:r>
+        <w:rPr>
+          <w:rFonts w:ascii="Courier New" w:eastAsia="Courier New" w:hAnsi="Courier New" w:cs="Courier New"/>
+          <w:sz w:val="24"/>
+          <w:szCs w:val="24"/>
+        </w:rPr>
+        <w:t>FarmDog</w:t>
+      </w:r>
+      <w:proofErr w:type="spellEnd"/>
+      <w:r>
+        <w:rPr>
+          <w:rFonts w:ascii="Courier New" w:eastAsia="Courier New" w:hAnsi="Courier New" w:cs="Courier New"/>
+          <w:sz w:val="24"/>
+          <w:szCs w:val="24"/>
+        </w:rPr>
+        <w:t>-App</w:t>
       </w:r>
     </w:p>
     <w:p>
@@ -16362,6 +16624,7 @@
           <w:szCs w:val="24"/>
         </w:rPr>
       </w:pPr>
+      <w:proofErr w:type="spellStart"/>
       <w:r>
         <w:rPr>
           <w:rFonts w:ascii="Courier New" w:eastAsia="Courier New" w:hAnsi="Courier New" w:cs="Courier New"/>
@@ -16369,7 +16632,16 @@
           <w:szCs w:val="24"/>
         </w:rPr>
         <w:lastRenderedPageBreak/>
-        <w:t>chmod +x install.sh</w:t>
+        <w:t>chmod</w:t>
+      </w:r>
+      <w:proofErr w:type="spellEnd"/>
+      <w:r>
+        <w:rPr>
+          <w:rFonts w:ascii="Courier New" w:eastAsia="Courier New" w:hAnsi="Courier New" w:cs="Courier New"/>
+          <w:sz w:val="24"/>
+          <w:szCs w:val="24"/>
+        </w:rPr>
+        <w:t xml:space="preserve"> +x install.sh</w:t>
       </w:r>
     </w:p>
     <w:p>
@@ -16480,7 +16752,7 @@
           <w:szCs w:val="32"/>
         </w:rPr>
       </w:pPr>
-      <w:bookmarkStart w:id="34" w:name="_Toc232003190"/>
+      <w:bookmarkStart w:id="33" w:name="_Toc232163486"/>
       <w:r>
         <w:rPr>
           <w:rFonts w:ascii="Arial" w:hAnsi="Arial" w:cs="Arial"/>
@@ -16497,7 +16769,7 @@
         </w:rPr>
         <w:t>ly run the program</w:t>
       </w:r>
-      <w:bookmarkEnd w:id="34"/>
+      <w:bookmarkEnd w:id="33"/>
     </w:p>
     <w:p>
       <w:pPr>
@@ -16598,7 +16870,25 @@
           <w:sz w:val="24"/>
           <w:szCs w:val="24"/>
         </w:rPr>
-        <w:t>cd FarmDog-App</w:t>
+        <w:t xml:space="preserve">cd </w:t>
+      </w:r>
+      <w:proofErr w:type="spellStart"/>
+      <w:r>
+        <w:rPr>
+          <w:rFonts w:ascii="Courier New" w:eastAsia="Courier New" w:hAnsi="Courier New" w:cs="Courier New"/>
+          <w:sz w:val="24"/>
+          <w:szCs w:val="24"/>
+        </w:rPr>
+        <w:t>FarmDog</w:t>
+      </w:r>
+      <w:proofErr w:type="spellEnd"/>
+      <w:r>
+        <w:rPr>
+          <w:rFonts w:ascii="Courier New" w:eastAsia="Courier New" w:hAnsi="Courier New" w:cs="Courier New"/>
+          <w:sz w:val="24"/>
+          <w:szCs w:val="24"/>
+        </w:rPr>
+        <w:t>-App</w:t>
       </w:r>
     </w:p>
     <w:p>
@@ -16650,7 +16940,25 @@
           <w:sz w:val="24"/>
           <w:szCs w:val="24"/>
         </w:rPr>
-        <w:t>source ~/FarmDog/bin/activate</w:t>
+        <w:t>source ~/</w:t>
+      </w:r>
+      <w:proofErr w:type="spellStart"/>
+      <w:r>
+        <w:rPr>
+          <w:rFonts w:ascii="Courier New" w:eastAsia="Courier New" w:hAnsi="Courier New" w:cs="Courier New"/>
+          <w:sz w:val="24"/>
+          <w:szCs w:val="24"/>
+        </w:rPr>
+        <w:t>FarmDog</w:t>
+      </w:r>
+      <w:proofErr w:type="spellEnd"/>
+      <w:r>
+        <w:rPr>
+          <w:rFonts w:ascii="Courier New" w:eastAsia="Courier New" w:hAnsi="Courier New" w:cs="Courier New"/>
+          <w:sz w:val="24"/>
+          <w:szCs w:val="24"/>
+        </w:rPr>
+        <w:t>/bin/activate</w:t>
       </w:r>
       <w:r>
         <w:rPr>
@@ -16752,7 +17060,7 @@
         <w:lastRenderedPageBreak/>
         <w:t xml:space="preserve">Ther terminal will output a local IP address and port number (e.g., </w:t>
       </w:r>
-      <w:hyperlink r:id="rId22" w:history="1">
+      <w:hyperlink r:id="rId18" w:history="1">
         <w:r>
           <w:rPr>
             <w:rStyle w:val="Hyperlink"/>
@@ -17041,12 +17349,12 @@
       <w:pPr>
         <w:pStyle w:val="Heading1"/>
       </w:pPr>
-      <w:bookmarkStart w:id="35" w:name="_Toc232003191"/>
+      <w:bookmarkStart w:id="34" w:name="_Toc232163487"/>
       <w:r>
         <w:lastRenderedPageBreak/>
         <w:t>Software Guide</w:t>
       </w:r>
-      <w:bookmarkEnd w:id="35"/>
+      <w:bookmarkEnd w:id="34"/>
       <w:r>
         <w:t xml:space="preserve"> </w:t>
       </w:r>
@@ -17217,7 +17525,7 @@
           <w:szCs w:val="24"/>
         </w:rPr>
         <w:drawing>
-          <wp:anchor distT="0" distB="0" distL="114300" distR="114300" simplePos="0" relativeHeight="251658254" behindDoc="0" locked="0" layoutInCell="1" allowOverlap="1" wp14:anchorId="77EA487E" wp14:editId="25E76AD4">
+          <wp:anchor distT="0" distB="0" distL="114300" distR="114300" simplePos="0" relativeHeight="251658254" behindDoc="0" locked="0" layoutInCell="1" allowOverlap="1" wp14:anchorId="77EA487E" wp14:editId="31552AFC">
             <wp:simplePos x="0" y="0"/>
             <wp:positionH relativeFrom="column">
               <wp:posOffset>718185</wp:posOffset>
@@ -17242,7 +17550,7 @@
                     </pic:cNvPicPr>
                   </pic:nvPicPr>
                   <pic:blipFill rotWithShape="1">
-                    <a:blip r:embed="rId23" cstate="print">
+                    <a:blip r:embed="rId19" cstate="print">
                       <a:extLst>
                         <a:ext uri="{28A0092B-C50C-407E-A947-70E740481C1C}">
                           <a14:useLocalDpi xmlns:a14="http://schemas.microsoft.com/office/drawing/2010/main" val="0"/>
@@ -17422,7 +17730,7 @@
         <w:spacing w:line="480" w:lineRule="auto"/>
         <w:jc w:val="both"/>
       </w:pPr>
-      <w:bookmarkStart w:id="36" w:name="_Toc232003192"/>
+      <w:bookmarkStart w:id="35" w:name="_Toc232163488"/>
       <w:r>
         <w:lastRenderedPageBreak/>
         <w:t>Find</w:t>
@@ -17430,7 +17738,7 @@
       <w:r>
         <w:t xml:space="preserve"> Mode</w:t>
       </w:r>
-      <w:bookmarkEnd w:id="36"/>
+      <w:bookmarkEnd w:id="35"/>
       <w:r>
         <w:t xml:space="preserve"> </w:t>
       </w:r>
@@ -17745,7 +18053,7 @@
                     </pic:cNvPicPr>
                   </pic:nvPicPr>
                   <pic:blipFill rotWithShape="1">
-                    <a:blip r:embed="rId24" cstate="print">
+                    <a:blip r:embed="rId20" cstate="print">
                       <a:extLst>
                         <a:ext uri="{28A0092B-C50C-407E-A947-70E740481C1C}">
                           <a14:useLocalDpi xmlns:a14="http://schemas.microsoft.com/office/drawing/2010/main" val="0"/>
@@ -17798,14 +18106,14 @@
           <w:rFonts w:ascii="Arial" w:hAnsi="Arial" w:cs="Arial"/>
         </w:rPr>
       </w:pPr>
-      <w:bookmarkStart w:id="37" w:name="_Toc232003193"/>
+      <w:bookmarkStart w:id="36" w:name="_Toc232163489"/>
       <w:r>
         <w:rPr>
           <w:rFonts w:ascii="Arial" w:hAnsi="Arial" w:cs="Arial"/>
         </w:rPr>
         <w:t>Map Mode</w:t>
       </w:r>
-      <w:bookmarkEnd w:id="37"/>
+      <w:bookmarkEnd w:id="36"/>
     </w:p>
     <w:p>
       <w:pPr>
@@ -18212,7 +18520,7 @@
           <w:szCs w:val="24"/>
         </w:rPr>
         <w:drawing>
-          <wp:anchor distT="0" distB="0" distL="114300" distR="114300" simplePos="0" relativeHeight="251658255" behindDoc="0" locked="0" layoutInCell="1" allowOverlap="1" wp14:anchorId="4B406726" wp14:editId="1E1EFD48">
+          <wp:anchor distT="0" distB="0" distL="114300" distR="114300" simplePos="0" relativeHeight="251658255" behindDoc="0" locked="0" layoutInCell="1" allowOverlap="1" wp14:anchorId="4B406726" wp14:editId="35204072">
             <wp:simplePos x="0" y="0"/>
             <wp:positionH relativeFrom="column">
               <wp:posOffset>0</wp:posOffset>
@@ -18235,7 +18543,7 @@
                     <pic:cNvPicPr/>
                   </pic:nvPicPr>
                   <pic:blipFill>
-                    <a:blip r:embed="rId25" cstate="print">
+                    <a:blip r:embed="rId21" cstate="print">
                       <a:extLst>
                         <a:ext uri="{28A0092B-C50C-407E-A947-70E740481C1C}">
                           <a14:useLocalDpi xmlns:a14="http://schemas.microsoft.com/office/drawing/2010/main" val="0"/>
@@ -18432,7 +18740,25 @@
           <w:szCs w:val="24"/>
         </w:rPr>
         <w:tab/>
-        <w:t>The generated CSV files are stored locally on the Rover in the following directory: /home/user-rover/FarmDog-App/output.</w:t>
+        <w:t>The generated CSV files are stored locally on the Rover in the following directory: /home/user-rover/</w:t>
+      </w:r>
+      <w:proofErr w:type="spellStart"/>
+      <w:r>
+        <w:rPr>
+          <w:rFonts w:ascii="Arial" w:hAnsi="Arial" w:cs="Arial"/>
+          <w:sz w:val="24"/>
+          <w:szCs w:val="24"/>
+        </w:rPr>
+        <w:t>FarmDog</w:t>
+      </w:r>
+      <w:proofErr w:type="spellEnd"/>
+      <w:r>
+        <w:rPr>
+          <w:rFonts w:ascii="Arial" w:hAnsi="Arial" w:cs="Arial"/>
+          <w:sz w:val="24"/>
+          <w:szCs w:val="24"/>
+        </w:rPr>
+        <w:t>-App/output.</w:t>
       </w:r>
     </w:p>
     <w:p>
@@ -18650,11 +18976,11 @@
         <w:spacing w:line="480" w:lineRule="auto"/>
         <w:jc w:val="both"/>
       </w:pPr>
-      <w:bookmarkStart w:id="38" w:name="_Toc232003194"/>
+      <w:bookmarkStart w:id="37" w:name="_Toc232163490"/>
       <w:r>
         <w:t>RTK Fix Status</w:t>
       </w:r>
-      <w:bookmarkEnd w:id="38"/>
+      <w:bookmarkEnd w:id="37"/>
       <w:r>
         <w:t xml:space="preserve"> </w:t>
       </w:r>
@@ -19030,14 +19356,14 @@
           <w:rFonts w:ascii="Arial" w:hAnsi="Arial" w:cs="Arial"/>
         </w:rPr>
       </w:pPr>
-      <w:bookmarkStart w:id="39" w:name="_Toc232003195"/>
+      <w:bookmarkStart w:id="38" w:name="_Toc232163491"/>
       <w:r>
         <w:rPr>
           <w:rFonts w:ascii="Arial" w:hAnsi="Arial" w:cs="Arial"/>
         </w:rPr>
         <w:t>HDOP (Horizontal Dilution of Precision)</w:t>
       </w:r>
-      <w:bookmarkEnd w:id="39"/>
+      <w:bookmarkEnd w:id="38"/>
     </w:p>
     <w:p>
       <w:pPr>
@@ -19330,11 +19656,11 @@
       <w:r>
         <w:t xml:space="preserve">  </w:t>
       </w:r>
-      <w:bookmarkStart w:id="40" w:name="_Toc232003196"/>
+      <w:bookmarkStart w:id="39" w:name="_Toc232163492"/>
       <w:r>
         <w:t>Error Handling &amp; Recovery</w:t>
       </w:r>
-      <w:bookmarkEnd w:id="40"/>
+      <w:bookmarkEnd w:id="39"/>
     </w:p>
     <w:p>
       <w:pPr>
@@ -19608,32 +19934,32 @@
       <w:r>
         <w:t xml:space="preserve"> </w:t>
       </w:r>
-      <w:bookmarkStart w:id="41" w:name="_Toc232003197"/>
+      <w:bookmarkStart w:id="40" w:name="_Toc232163493"/>
       <w:r>
         <w:t>Troubleshooting</w:t>
       </w:r>
+      <w:bookmarkEnd w:id="40"/>
+    </w:p>
+    <w:p>
+      <w:pPr>
+        <w:spacing w:line="480" w:lineRule="auto"/>
+        <w:jc w:val="both"/>
+      </w:pPr>
+    </w:p>
+    <w:p>
+      <w:pPr>
+        <w:pStyle w:val="Heading2"/>
+        <w:spacing w:line="480" w:lineRule="auto"/>
+        <w:jc w:val="both"/>
+      </w:pPr>
+      <w:bookmarkStart w:id="41" w:name="_Toc232163494"/>
+      <w:r>
+        <w:t>I</w:t>
+      </w:r>
+      <w:r>
+        <w:t xml:space="preserve"> cannot open the Farm Dog web page</w:t>
+      </w:r>
       <w:bookmarkEnd w:id="41"/>
-    </w:p>
-    <w:p>
-      <w:pPr>
-        <w:spacing w:line="480" w:lineRule="auto"/>
-        <w:jc w:val="both"/>
-      </w:pPr>
-    </w:p>
-    <w:p>
-      <w:pPr>
-        <w:pStyle w:val="Heading2"/>
-        <w:spacing w:line="480" w:lineRule="auto"/>
-        <w:jc w:val="both"/>
-      </w:pPr>
-      <w:bookmarkStart w:id="42" w:name="_Toc232003198"/>
-      <w:r>
-        <w:t>I</w:t>
-      </w:r>
-      <w:r>
-        <w:t xml:space="preserve"> cannot open the Farm Dog web page</w:t>
-      </w:r>
-      <w:bookmarkEnd w:id="42"/>
     </w:p>
     <w:p>
       <w:pPr>
@@ -19770,11 +20096,11 @@
         <w:spacing w:line="480" w:lineRule="auto"/>
         <w:jc w:val="both"/>
       </w:pPr>
-      <w:bookmarkStart w:id="43" w:name="_Toc232003199"/>
+      <w:bookmarkStart w:id="42" w:name="_Toc232163495"/>
       <w:r>
         <w:t>GPS data is not updating</w:t>
       </w:r>
-      <w:bookmarkEnd w:id="43"/>
+      <w:bookmarkEnd w:id="42"/>
     </w:p>
     <w:p>
       <w:pPr>
@@ -19854,11 +20180,11 @@
         <w:spacing w:line="480" w:lineRule="auto"/>
         <w:jc w:val="both"/>
       </w:pPr>
-      <w:bookmarkStart w:id="44" w:name="_Toc232003200"/>
+      <w:bookmarkStart w:id="43" w:name="_Toc232163496"/>
       <w:r>
         <w:t>RTK correction is not working</w:t>
       </w:r>
-      <w:bookmarkEnd w:id="44"/>
+      <w:bookmarkEnd w:id="43"/>
     </w:p>
     <w:p>
       <w:pPr>
@@ -19938,11 +20264,11 @@
         <w:spacing w:line="480" w:lineRule="auto"/>
         <w:jc w:val="both"/>
       </w:pPr>
-      <w:bookmarkStart w:id="45" w:name="_Toc232003201"/>
+      <w:bookmarkStart w:id="44" w:name="_Toc232163497"/>
       <w:r>
         <w:t>Points are not saving to CSV</w:t>
       </w:r>
-      <w:bookmarkEnd w:id="45"/>
+      <w:bookmarkEnd w:id="44"/>
     </w:p>
     <w:p>
       <w:pPr>
@@ -20022,7 +20348,25 @@
           <w:szCs w:val="24"/>
         </w:rPr>
         <w:lastRenderedPageBreak/>
-        <w:t>Check that the local output folder (/home/user-rover/FarmDog-App</w:t>
+        <w:t>Check that the local output folder (/home/user-rover/</w:t>
+      </w:r>
+      <w:proofErr w:type="spellStart"/>
+      <w:r>
+        <w:rPr>
+          <w:rFonts w:ascii="Arial" w:hAnsi="Arial" w:cs="Arial"/>
+          <w:sz w:val="24"/>
+          <w:szCs w:val="24"/>
+        </w:rPr>
+        <w:t>FarmDog</w:t>
+      </w:r>
+      <w:proofErr w:type="spellEnd"/>
+      <w:r>
+        <w:rPr>
+          <w:rFonts w:ascii="Arial" w:hAnsi="Arial" w:cs="Arial"/>
+          <w:sz w:val="24"/>
+          <w:szCs w:val="24"/>
+        </w:rPr>
+        <w:t>-App</w:t>
       </w:r>
       <w:r>
         <w:rPr>
@@ -20039,11 +20383,11 @@
         <w:spacing w:line="480" w:lineRule="auto"/>
         <w:jc w:val="both"/>
       </w:pPr>
-      <w:bookmarkStart w:id="46" w:name="_Toc232003202"/>
+      <w:bookmarkStart w:id="45" w:name="_Toc232163498"/>
       <w:r>
         <w:t>Position appears unstable</w:t>
       </w:r>
-      <w:bookmarkEnd w:id="46"/>
+      <w:bookmarkEnd w:id="45"/>
     </w:p>
     <w:p>
       <w:pPr>
@@ -20333,58 +20677,47 @@
           <w:rFonts w:ascii="Arial" w:hAnsi="Arial" w:cs="Arial"/>
         </w:rPr>
       </w:pPr>
-      <w:bookmarkStart w:id="47" w:name="_Toc232003203"/>
+      <w:bookmarkStart w:id="46" w:name="_Toc232163499"/>
       <w:r>
         <w:lastRenderedPageBreak/>
         <w:t>Appendix</w:t>
       </w:r>
+      <w:bookmarkEnd w:id="46"/>
+    </w:p>
+    <w:p>
+      <w:pPr>
+        <w:pStyle w:val="Heading2"/>
+        <w:spacing w:line="480" w:lineRule="auto"/>
+        <w:rPr>
+          <w:rFonts w:ascii="Arial" w:hAnsi="Arial" w:cs="Arial"/>
+        </w:rPr>
+      </w:pPr>
+      <w:bookmarkStart w:id="47" w:name="_Toc232163500"/>
+      <w:r>
+        <w:rPr>
+          <w:rFonts w:ascii="Arial" w:hAnsi="Arial" w:cs="Arial"/>
+        </w:rPr>
+        <w:t xml:space="preserve">Appendix </w:t>
+      </w:r>
+      <w:r>
+        <w:rPr>
+          <w:rFonts w:ascii="Arial" w:hAnsi="Arial" w:cs="Arial"/>
+        </w:rPr>
+        <w:t>A</w:t>
+      </w:r>
+      <w:r>
+        <w:rPr>
+          <w:rFonts w:ascii="Arial" w:hAnsi="Arial" w:cs="Arial"/>
+        </w:rPr>
+        <w:t xml:space="preserve"> </w:t>
+      </w:r>
+      <w:r>
+        <w:rPr>
+          <w:rFonts w:ascii="Arial" w:hAnsi="Arial" w:cs="Arial"/>
+        </w:rPr>
+        <w:t>— NMEA Input Format</w:t>
+      </w:r>
       <w:bookmarkEnd w:id="47"/>
-    </w:p>
-    <w:p>
-      <w:pPr>
-        <w:pStyle w:val="Heading2"/>
-        <w:spacing w:line="480" w:lineRule="auto"/>
-        <w:rPr>
-          <w:rFonts w:ascii="Arial" w:hAnsi="Arial" w:cs="Arial"/>
-        </w:rPr>
-      </w:pPr>
-      <w:bookmarkStart w:id="48" w:name="_Toc232003205"/>
-      <w:commentRangeStart w:id="49"/>
-      <w:r>
-        <w:rPr>
-          <w:rFonts w:ascii="Arial" w:hAnsi="Arial" w:cs="Arial"/>
-        </w:rPr>
-        <w:t xml:space="preserve">Appendix </w:t>
-      </w:r>
-      <w:r>
-        <w:rPr>
-          <w:rFonts w:ascii="Arial" w:hAnsi="Arial" w:cs="Arial"/>
-        </w:rPr>
-        <w:t>A</w:t>
-      </w:r>
-      <w:r>
-        <w:rPr>
-          <w:rFonts w:ascii="Arial" w:hAnsi="Arial" w:cs="Arial"/>
-        </w:rPr>
-        <w:t xml:space="preserve"> </w:t>
-      </w:r>
-      <w:r>
-        <w:rPr>
-          <w:rFonts w:ascii="Arial" w:hAnsi="Arial" w:cs="Arial"/>
-        </w:rPr>
-        <w:t>— NMEA Input Format</w:t>
-      </w:r>
-      <w:bookmarkEnd w:id="48"/>
-      <w:commentRangeEnd w:id="49"/>
-      <w:r>
-        <w:rPr>
-          <w:rStyle w:val="CommentReference"/>
-          <w:rFonts w:ascii="Arial" w:hAnsi="Arial" w:cs="Arial"/>
-          <w:sz w:val="32"/>
-          <w:szCs w:val="32"/>
-        </w:rPr>
-        <w:commentReference w:id="49"/>
-      </w:r>
     </w:p>
     <w:p>
       <w:pPr>
@@ -20755,7 +21088,7 @@
           <w:rFonts w:ascii="Arial" w:hAnsi="Arial" w:cs="Arial"/>
         </w:rPr>
       </w:pPr>
-      <w:bookmarkStart w:id="50" w:name="_Toc232003206"/>
+      <w:bookmarkStart w:id="48" w:name="_Toc232163501"/>
       <w:r>
         <w:rPr>
           <w:rFonts w:ascii="Arial" w:hAnsi="Arial" w:cs="Arial"/>
@@ -20774,7 +21107,7 @@
         </w:rPr>
         <w:t xml:space="preserve"> — CSV Output Format</w:t>
       </w:r>
-      <w:bookmarkEnd w:id="50"/>
+      <w:bookmarkEnd w:id="48"/>
     </w:p>
     <w:p>
       <w:pPr>
@@ -20954,7 +21287,25 @@
           <w:sz w:val="24"/>
           <w:szCs w:val="24"/>
         </w:rPr>
-        <w:t xml:space="preserve">, latitude, longitude, altitude, fix, satellites, hdop and </w:t>
+        <w:t xml:space="preserve">, latitude, longitude, altitude, fix, satellites, </w:t>
+      </w:r>
+      <w:proofErr w:type="spellStart"/>
+      <w:r>
+        <w:rPr>
+          <w:rFonts w:ascii="Arial" w:hAnsi="Arial" w:cs="Arial"/>
+          <w:sz w:val="24"/>
+          <w:szCs w:val="24"/>
+        </w:rPr>
+        <w:t>hdop</w:t>
+      </w:r>
+      <w:proofErr w:type="spellEnd"/>
+      <w:r>
+        <w:rPr>
+          <w:rFonts w:ascii="Arial" w:hAnsi="Arial" w:cs="Arial"/>
+          <w:sz w:val="24"/>
+          <w:szCs w:val="24"/>
+        </w:rPr>
+        <w:t xml:space="preserve"> and </w:t>
       </w:r>
       <w:r>
         <w:rPr>
@@ -20993,7 +21344,7 @@
                     <pic:cNvPicPr/>
                   </pic:nvPicPr>
                   <pic:blipFill>
-                    <a:blip r:embed="rId26"/>
+                    <a:blip r:embed="rId22"/>
                     <a:stretch>
                       <a:fillRect/>
                     </a:stretch>
@@ -21015,11 +21366,11 @@
       </w:r>
     </w:p>
     <w:sectPr>
-      <w:headerReference w:type="default" r:id="rId27"/>
-      <w:footerReference w:type="even" r:id="rId28"/>
-      <w:footerReference w:type="default" r:id="rId29"/>
-      <w:headerReference w:type="first" r:id="rId30"/>
-      <w:footerReference w:type="first" r:id="rId31"/>
+      <w:headerReference w:type="default" r:id="rId23"/>
+      <w:footerReference w:type="even" r:id="rId24"/>
+      <w:footerReference w:type="default" r:id="rId25"/>
+      <w:headerReference w:type="first" r:id="rId26"/>
+      <w:footerReference w:type="first" r:id="rId27"/>
       <w:pgSz w:w="11906" w:h="16838"/>
       <w:pgMar w:top="1712" w:right="1440" w:bottom="1667" w:left="1440" w:header="708" w:footer="708" w:gutter="0"/>
       <w:cols w:space="708"/>
@@ -21028,65 +21379,6 @@
     </w:sectPr>
   </w:body>
 </w:document>
-</file>
-
-<file path=word/comments.xml><?xml version="1.0" encoding="utf-8"?>
-<w:comments xmlns:wpc="http://schemas.microsoft.com/office/word/2010/wordprocessingCanvas" xmlns:cx="http://schemas.microsoft.com/office/drawing/2014/chartex" xmlns:cx1="http://schemas.microsoft.com/office/drawing/2015/9/8/chartex" xmlns:cx2="http://schemas.microsoft.com/office/drawing/2015/10/21/chartex" xmlns:cx3="http://schemas.microsoft.com/office/drawing/2016/5/9/chartex" xmlns:cx4="http://schemas.microsoft.com/office/drawing/2016/5/10/chartex" xmlns:cx5="http://schemas.microsoft.com/office/drawing/2016/5/11/chartex" xmlns:cx6="http://schemas.microsoft.com/office/drawing/2016/5/12/chartex" xmlns:cx7="http://schemas.microsoft.com/office/drawing/2016/5/13/chartex" xmlns:cx8="http://schemas.microsoft.com/office/drawing/2016/5/14/chartex" xmlns:mc="http://schemas.openxmlformats.org/markup-compatibility/2006" xmlns:aink="http://schemas.microsoft.com/office/drawing/2016/ink" xmlns:am3d="http://schemas.microsoft.com/office/drawing/2017/model3d" xmlns:o="urn:schemas-microsoft-com:office:office" xmlns:oel="http://schemas.microsoft.com/office/2019/extlst" xmlns:r="http://schemas.openxmlformats.org/officeDocument/2006/relationships" xmlns:m="http://schemas.openxmlformats.org/officeDocument/2006/math" xmlns:v="urn:schemas-microsoft-com:vml" xmlns:wp14="http://schemas.microsoft.com/office/word/2010/wordprocessingDrawing" xmlns:wp="http://schemas.openxmlformats.org/drawingml/2006/wordprocessingDrawing" xmlns:w10="urn:schemas-microsoft-com:office:word" xmlns:w="http://schemas.openxmlformats.org/wordprocessingml/2006/main" xmlns:w14="http://schemas.microsoft.com/office/word/2010/wordml" xmlns:w15="http://schemas.microsoft.com/office/word/2012/wordml" xmlns:w16cex="http://schemas.microsoft.com/office/word/2018/wordml/cex" xmlns:w16cid="http://schemas.microsoft.com/office/word/2016/wordml/cid" xmlns:w16="http://schemas.microsoft.com/office/word/2018/wordml" xmlns:w16du="http://schemas.microsoft.com/office/word/2023/wordml/word16du" xmlns:w16sdtdh="http://schemas.microsoft.com/office/word/2020/wordml/sdtdatahash" xmlns:w16sdtfl="http://schemas.microsoft.com/office/word/2024/wordml/sdtformatlock" xmlns:w16se="http://schemas.microsoft.com/office/word/2015/wordml/symex" xmlns:wpg="http://schemas.microsoft.com/office/word/2010/wordprocessingGroup" xmlns:wpi="http://schemas.microsoft.com/office/word/2010/wordprocessingInk" xmlns:wne="http://schemas.microsoft.com/office/word/2006/wordml" xmlns:wps="http://schemas.microsoft.com/office/word/2010/wordprocessingShape" mc:Ignorable="w14 w15 w16se w16cid w16 w16cex w16sdtdh w16sdtfl w16du wp14">
-  <w:comment w:id="11" w:author="Aldo Keo" w:date="2026-06-09T21:23:00Z" w:initials="AK">
-    <w:p>
-      <w:r>
-        <w:rPr>
-          <w:rStyle w:val="CommentReference"/>
-        </w:rPr>
-        <w:annotationRef/>
-      </w:r>
-      <w:r>
-        <w:rPr>
-          <w:sz w:val="20"/>
-          <w:szCs w:val="20"/>
-        </w:rPr>
-        <w:t>Too many listed</w:t>
-      </w:r>
-    </w:p>
-  </w:comment>
-  <w:comment w:id="49" w:author="Tim Fausten" w:date="2026-06-07T21:25:00Z" w:initials="TF">
-    <w:p>
-      <w:pPr>
-        <w:pStyle w:val="CommentText"/>
-      </w:pPr>
-      <w:r>
-        <w:rPr>
-          <w:rStyle w:val="CommentReference"/>
-        </w:rPr>
-        <w:annotationRef/>
-      </w:r>
-      <w:r>
-        <w:t>This is so far only a copy and paste from the Design document. Please check or rewrite as needed.</w:t>
-      </w:r>
-    </w:p>
-  </w:comment>
-</w:comments>
-</file>
-
-<file path=word/commentsExtended.xml><?xml version="1.0" encoding="utf-8"?>
-<w15:commentsEx xmlns:wpc="http://schemas.microsoft.com/office/word/2010/wordprocessingCanvas" xmlns:cx="http://schemas.microsoft.com/office/drawing/2014/chartex" xmlns:cx1="http://schemas.microsoft.com/office/drawing/2015/9/8/chartex" xmlns:cx2="http://schemas.microsoft.com/office/drawing/2015/10/21/chartex" xmlns:cx3="http://schemas.microsoft.com/office/drawing/2016/5/9/chartex" xmlns:cx4="http://schemas.microsoft.com/office/drawing/2016/5/10/chartex" xmlns:cx5="http://schemas.microsoft.com/office/drawing/2016/5/11/chartex" xmlns:cx6="http://schemas.microsoft.com/office/drawing/2016/5/12/chartex" xmlns:cx7="http://schemas.microsoft.com/office/drawing/2016/5/13/chartex" xmlns:cx8="http://schemas.microsoft.com/office/drawing/2016/5/14/chartex" xmlns:mc="http://schemas.openxmlformats.org/markup-compatibility/2006" xmlns:aink="http://schemas.microsoft.com/office/drawing/2016/ink" xmlns:am3d="http://schemas.microsoft.com/office/drawing/2017/model3d" xmlns:o="urn:schemas-microsoft-com:office:office" xmlns:oel="http://schemas.microsoft.com/office/2019/extlst" xmlns:r="http://schemas.openxmlformats.org/officeDocument/2006/relationships" xmlns:m="http://schemas.openxmlformats.org/officeDocument/2006/math" xmlns:v="urn:schemas-microsoft-com:vml" xmlns:wp14="http://schemas.microsoft.com/office/word/2010/wordprocessingDrawing" xmlns:wp="http://schemas.openxmlformats.org/drawingml/2006/wordprocessingDrawing" xmlns:w10="urn:schemas-microsoft-com:office:word" xmlns:w="http://schemas.openxmlformats.org/wordprocessingml/2006/main" xmlns:w14="http://schemas.microsoft.com/office/word/2010/wordml" xmlns:w15="http://schemas.microsoft.com/office/word/2012/wordml" xmlns:w16cex="http://schemas.microsoft.com/office/word/2018/wordml/cex" xmlns:w16cid="http://schemas.microsoft.com/office/word/2016/wordml/cid" xmlns:w16="http://schemas.microsoft.com/office/word/2018/wordml" xmlns:w16du="http://schemas.microsoft.com/office/word/2023/wordml/word16du" xmlns:w16sdtdh="http://schemas.microsoft.com/office/word/2020/wordml/sdtdatahash" xmlns:w16sdtfl="http://schemas.microsoft.com/office/word/2024/wordml/sdtformatlock" xmlns:w16se="http://schemas.microsoft.com/office/word/2015/wordml/symex" xmlns:wpg="http://schemas.microsoft.com/office/word/2010/wordprocessingGroup" xmlns:wpi="http://schemas.microsoft.com/office/word/2010/wordprocessingInk" xmlns:wne="http://schemas.microsoft.com/office/word/2006/wordml" xmlns:wps="http://schemas.microsoft.com/office/word/2010/wordprocessingShape" mc:Ignorable="w14 w15 w16se w16cid w16 w16cex w16sdtdh w16sdtfl w16du wp14">
-  <w15:commentEx w15:paraId="65C92B3A" w15:done="1"/>
-  <w15:commentEx w15:paraId="2D3ABFB6" w15:done="1"/>
-</w15:commentsEx>
-</file>
-
-<file path=word/commentsExtensible.xml><?xml version="1.0" encoding="utf-8"?>
-<w16cex:commentsExtensible xmlns:wpc="http://schemas.microsoft.com/office/word/2010/wordprocessingCanvas" xmlns:cx="http://schemas.microsoft.com/office/drawing/2014/chartex" xmlns:cx1="http://schemas.microsoft.com/office/drawing/2015/9/8/chartex" xmlns:cx2="http://schemas.microsoft.com/office/drawing/2015/10/21/chartex" xmlns:cx3="http://schemas.microsoft.com/office/drawing/2016/5/9/chartex" xmlns:cx4="http://schemas.microsoft.com/office/drawing/2016/5/10/chartex" xmlns:cx5="http://schemas.microsoft.com/office/drawing/2016/5/11/chartex" xmlns:cx6="http://schemas.microsoft.com/office/drawing/2016/5/12/chartex" xmlns:cx7="http://schemas.microsoft.com/office/drawing/2016/5/13/chartex" xmlns:cx8="http://schemas.microsoft.com/office/drawing/2016/5/14/chartex" xmlns:cr="http://schemas.microsoft.com/office/comments/2020/reactions" xmlns:mc="http://schemas.openxmlformats.org/markup-compatibility/2006" xmlns:aink="http://schemas.microsoft.com/office/drawing/2016/ink" xmlns:am3d="http://schemas.microsoft.com/office/drawing/2017/model3d" xmlns:o="urn:schemas-microsoft-com:office:office" xmlns:oel="http://schemas.microsoft.com/office/2019/extlst" xmlns:r="http://schemas.openxmlformats.org/officeDocument/2006/relationships" xmlns:m="http://schemas.openxmlformats.org/officeDocument/2006/math" xmlns:v="urn:schemas-microsoft-com:vml" xmlns:wp14="http://schemas.microsoft.com/office/word/2010/wordprocessingDrawing" xmlns:wp="http://schemas.openxmlformats.org/drawingml/2006/wordprocessingDrawing" xmlns:w10="urn:schemas-microsoft-com:office:word" xmlns:w="http://schemas.openxmlformats.org/wordprocessingml/2006/main" xmlns:w14="http://schemas.microsoft.com/office/word/2010/wordml" xmlns:w15="http://schemas.microsoft.com/office/word/2012/wordml" xmlns:w16cex="http://schemas.microsoft.com/office/word/2018/wordml/cex" xmlns:w16cid="http://schemas.microsoft.com/office/word/2016/wordml/cid" xmlns:w16="http://schemas.microsoft.com/office/word/2018/wordml" xmlns:w16du="http://schemas.microsoft.com/office/word/2023/wordml/word16du" xmlns:w16sdtdh="http://schemas.microsoft.com/office/word/2020/wordml/sdtdatahash" xmlns:w16sdtfl="http://schemas.microsoft.com/office/word/2024/wordml/sdtformatlock" xmlns:w16se="http://schemas.microsoft.com/office/word/2015/wordml/symex" xmlns:wpg="http://schemas.microsoft.com/office/word/2010/wordprocessingGroup" xmlns:wpi="http://schemas.microsoft.com/office/word/2010/wordprocessingInk" xmlns:wne="http://schemas.microsoft.com/office/word/2006/wordml" xmlns:wps="http://schemas.microsoft.com/office/word/2010/wordprocessingShape" mc:Ignorable="w14 w15 w16se w16cid w16 w16cex w16sdtdh w16sdtfl cr w16du wp14">
-  <w16cex:commentExtensible w16cex:durableId="506FE3B1" w16cex:dateUtc="2026-06-09T13:23:00Z"/>
-  <w16cex:commentExtensible w16cex:durableId="26D2C963" w16cex:dateUtc="2026-06-07T13:25:00Z"/>
-</w16cex:commentsExtensible>
-</file>
-
-<file path=word/commentsIds.xml><?xml version="1.0" encoding="utf-8"?>
-<w16cid:commentsIds xmlns:wpc="http://schemas.microsoft.com/office/word/2010/wordprocessingCanvas" xmlns:cx="http://schemas.microsoft.com/office/drawing/2014/chartex" xmlns:cx1="http://schemas.microsoft.com/office/drawing/2015/9/8/chartex" xmlns:cx2="http://schemas.microsoft.com/office/drawing/2015/10/21/chartex" xmlns:cx3="http://schemas.microsoft.com/office/drawing/2016/5/9/chartex" xmlns:cx4="http://schemas.microsoft.com/office/drawing/2016/5/10/chartex" xmlns:cx5="http://schemas.microsoft.com/office/drawing/2016/5/11/chartex" xmlns:cx6="http://schemas.microsoft.com/office/drawing/2016/5/12/chartex" xmlns:cx7="http://schemas.microsoft.com/office/drawing/2016/5/13/chartex" xmlns:cx8="http://schemas.microsoft.com/office/drawing/2016/5/14/chartex" xmlns:mc="http://schemas.openxmlformats.org/markup-compatibility/2006" xmlns:aink="http://schemas.microsoft.com/office/drawing/2016/ink" xmlns:am3d="http://schemas.microsoft.com/office/drawing/2017/model3d" xmlns:o="urn:schemas-microsoft-com:office:office" xmlns:oel="http://schemas.microsoft.com/office/2019/extlst" xmlns:r="http://schemas.openxmlformats.org/officeDocument/2006/relationships" xmlns:m="http://schemas.openxmlformats.org/officeDocument/2006/math" xmlns:v="urn:schemas-microsoft-com:vml" xmlns:wp14="http://schemas.microsoft.com/office/word/2010/wordprocessingDrawing" xmlns:wp="http://schemas.openxmlformats.org/drawingml/2006/wordprocessingDrawing" xmlns:w10="urn:schemas-microsoft-com:office:word" xmlns:w="http://schemas.openxmlformats.org/wordprocessingml/2006/main" xmlns:w14="http://schemas.microsoft.com/office/word/2010/wordml" xmlns:w15="http://schemas.microsoft.com/office/word/2012/wordml" xmlns:w16cex="http://schemas.microsoft.com/office/word/2018/wordml/cex" xmlns:w16cid="http://schemas.microsoft.com/office/word/2016/wordml/cid" xmlns:w16="http://schemas.microsoft.com/office/word/2018/wordml" xmlns:w16du="http://schemas.microsoft.com/office/word/2023/wordml/word16du" xmlns:w16sdtdh="http://schemas.microsoft.com/office/word/2020/wordml/sdtdatahash" xmlns:w16sdtfl="http://schemas.microsoft.com/office/word/2024/wordml/sdtformatlock" xmlns:w16se="http://schemas.microsoft.com/office/word/2015/wordml/symex" xmlns:wpg="http://schemas.microsoft.com/office/word/2010/wordprocessingGroup" xmlns:wpi="http://schemas.microsoft.com/office/word/2010/wordprocessingInk" xmlns:wne="http://schemas.microsoft.com/office/word/2006/wordml" xmlns:wps="http://schemas.microsoft.com/office/word/2010/wordprocessingShape" mc:Ignorable="w14 w15 w16se w16cid w16 w16cex w16sdtdh w16sdtfl w16du wp14">
-  <w16cid:commentId w16cid:paraId="65C92B3A" w16cid:durableId="506FE3B1"/>
-  <w16cid:commentId w16cid:paraId="2D3ABFB6" w16cid:durableId="26D2C963"/>
-</w16cid:commentsIds>
 </file>
 
 <file path=word/endnotes.xml><?xml version="1.0" encoding="utf-8"?>
@@ -21197,7 +21489,7 @@
             </wp:anchor>
           </w:drawing>
         </mc:Choice>
-        <mc:Fallback xmlns:a="http://schemas.openxmlformats.org/drawingml/2006/main" xmlns:aclsh="http://schemas.microsoft.com/office/drawing/2020/classificationShape" xmlns:arto="http://schemas.microsoft.com/office/word/2006/arto">
+        <mc:Fallback xmlns:arto="http://schemas.microsoft.com/office/word/2006/arto" xmlns:aclsh="http://schemas.microsoft.com/office/drawing/2020/classificationShape" xmlns:a="http://schemas.openxmlformats.org/drawingml/2006/main">
           <w:pict w14:anchorId="6DF2CF9C">
             <v:shapetype id="_x0000_t202" coordsize="21600,21600" o:spt="202" path="m,l,21600r21600,l21600,xe" w14:anchorId="5091D5A6">
               <v:stroke joinstyle="miter"/>
@@ -21320,7 +21612,7 @@
             </wp:anchor>
           </w:drawing>
         </mc:Choice>
-        <mc:Fallback xmlns:a="http://schemas.openxmlformats.org/drawingml/2006/main" xmlns:aclsh="http://schemas.microsoft.com/office/drawing/2020/classificationShape" xmlns:arto="http://schemas.microsoft.com/office/word/2006/arto">
+        <mc:Fallback xmlns:arto="http://schemas.microsoft.com/office/word/2006/arto" xmlns:aclsh="http://schemas.microsoft.com/office/drawing/2020/classificationShape" xmlns:a="http://schemas.openxmlformats.org/drawingml/2006/main">
           <w:pict w14:anchorId="7F24194C">
             <v:shapetype id="_x0000_t202" coordsize="21600,21600" o:spt="202" path="m,l,21600r21600,l21600,xe" w14:anchorId="1D5C9B5E">
               <v:stroke joinstyle="miter"/>
@@ -21504,7 +21796,7 @@
                   </wp:anchor>
                 </w:drawing>
               </mc:Choice>
-              <mc:Fallback xmlns:a="http://schemas.openxmlformats.org/drawingml/2006/main" xmlns:aclsh="http://schemas.microsoft.com/office/drawing/2020/classificationShape" xmlns:arto="http://schemas.microsoft.com/office/word/2006/arto">
+              <mc:Fallback xmlns:arto="http://schemas.microsoft.com/office/word/2006/arto" xmlns:aclsh="http://schemas.microsoft.com/office/drawing/2020/classificationShape" xmlns:a="http://schemas.openxmlformats.org/drawingml/2006/main">
                 <w:pict w14:anchorId="65136920">
                   <v:shapetype id="_x0000_t202" coordsize="21600,21600" o:spt="202" path="m,l,21600r21600,l21600,xe" w14:anchorId="74D7CB33">
                     <v:stroke joinstyle="miter"/>
@@ -26445,17 +26737,6 @@
   </w:num>
   <w:numIdMacAtCleanup w:val="27"/>
 </w:numbering>
-</file>
-
-<file path=word/people.xml><?xml version="1.0" encoding="utf-8"?>
-<w15:people xmlns:wpc="http://schemas.microsoft.com/office/word/2010/wordprocessingCanvas" xmlns:cx="http://schemas.microsoft.com/office/drawing/2014/chartex" xmlns:cx1="http://schemas.microsoft.com/office/drawing/2015/9/8/chartex" xmlns:cx2="http://schemas.microsoft.com/office/drawing/2015/10/21/chartex" xmlns:cx3="http://schemas.microsoft.com/office/drawing/2016/5/9/chartex" xmlns:cx4="http://schemas.microsoft.com/office/drawing/2016/5/10/chartex" xmlns:cx5="http://schemas.microsoft.com/office/drawing/2016/5/11/chartex" xmlns:cx6="http://schemas.microsoft.com/office/drawing/2016/5/12/chartex" xmlns:cx7="http://schemas.microsoft.com/office/drawing/2016/5/13/chartex" xmlns:cx8="http://schemas.microsoft.com/office/drawing/2016/5/14/chartex" xmlns:mc="http://schemas.openxmlformats.org/markup-compatibility/2006" xmlns:aink="http://schemas.microsoft.com/office/drawing/2016/ink" xmlns:am3d="http://schemas.microsoft.com/office/drawing/2017/model3d" xmlns:o="urn:schemas-microsoft-com:office:office" xmlns:oel="http://schemas.microsoft.com/office/2019/extlst" xmlns:r="http://schemas.openxmlformats.org/officeDocument/2006/relationships" xmlns:m="http://schemas.openxmlformats.org/officeDocument/2006/math" xmlns:v="urn:schemas-microsoft-com:vml" xmlns:wp14="http://schemas.microsoft.com/office/word/2010/wordprocessingDrawing" xmlns:wp="http://schemas.openxmlformats.org/drawingml/2006/wordprocessingDrawing" xmlns:w10="urn:schemas-microsoft-com:office:word" xmlns:w="http://schemas.openxmlformats.org/wordprocessingml/2006/main" xmlns:w14="http://schemas.microsoft.com/office/word/2010/wordml" xmlns:w15="http://schemas.microsoft.com/office/word/2012/wordml" xmlns:w16cex="http://schemas.microsoft.com/office/word/2018/wordml/cex" xmlns:w16cid="http://schemas.microsoft.com/office/word/2016/wordml/cid" xmlns:w16="http://schemas.microsoft.com/office/word/2018/wordml" xmlns:w16du="http://schemas.microsoft.com/office/word/2023/wordml/word16du" xmlns:w16sdtdh="http://schemas.microsoft.com/office/word/2020/wordml/sdtdatahash" xmlns:w16sdtfl="http://schemas.microsoft.com/office/word/2024/wordml/sdtformatlock" xmlns:w16se="http://schemas.microsoft.com/office/word/2015/wordml/symex" xmlns:wpg="http://schemas.microsoft.com/office/word/2010/wordprocessingGroup" xmlns:wpi="http://schemas.microsoft.com/office/word/2010/wordprocessingInk" xmlns:wne="http://schemas.microsoft.com/office/word/2006/wordml" xmlns:wps="http://schemas.microsoft.com/office/word/2010/wordprocessingShape" mc:Ignorable="w14 w15 w16se w16cid w16 w16cex w16sdtdh w16sdtfl w16du wp14">
-  <w15:person w15:author="Aldo Keo">
-    <w15:presenceInfo w15:providerId="AD" w15:userId="S::33464263@student.murdoch.edu.au::2dbc00e3-b3fb-488f-8c1a-85055e1677e2"/>
-  </w15:person>
-  <w15:person w15:author="Tim Fausten">
-    <w15:presenceInfo w15:providerId="AD" w15:userId="S::34492493@student.murdoch.edu.au::b31249ea-bb5e-45c6-b8cc-ef539f89b130"/>
-  </w15:person>
-</w15:people>
 </file>
 
 <file path=word/styles.xml><?xml version="1.0" encoding="utf-8"?>

</xml_diff>